<commit_message>
docs(report): record the verified CI result and the three CI-only defects
Both jobs are green on run 38875213993. Section 12.4 now records what CI actually
proved and the three bugs that only the runners exposed: the connection-close
dependency in the HTTP test helper, the silent no-op in the specified XcodeGen guard
(XcodeGen is not installed on macos-14), and the XcodeGen 2.44+/Xcode 15 project-format
incompatibility that objectVersion and compatibilityVersion both fail to control.
Section 12.5 restates the limits: no device, no rendered UI, no signed watch build.
The .docx is regenerated from the .md by scripts/markdown_to_docx.py.
</commit_message>
<xml_diff>
--- a/docs/AW9_PIXEL_BRIDGE_ENGAGEMENT_REPORT.docx
+++ b/docs/AW9_PIXEL_BRIDGE_ENGAGEMENT_REPORT.docx
@@ -13043,31 +13043,26 @@
         <w:pStyle w:val="Heading2"/>
       </w:pPr>
       <w:r>
-        <w:t>12.4 Honest limits of this verification</w:t>
+        <w:t>12.4 What CI proved, and the three bugs it found that local runs did not</w:t>
       </w:r>
     </w:p>
     <w:p>
-      <w:pPr>
-        <w:pStyle w:val="ListBullet"/>
-      </w:pPr>
+      <w:r>
+        <w:t xml:space="preserve">The v1.1.0 push ran the real workflow. </w:t>
+      </w:r>
       <w:r>
         <w:rPr>
           <w:b/>
         </w:rPr>
-        <w:t>Swift is typed-checked only in CI.</w:t>
-      </w:r>
-      <w:r>
-        <w:t xml:space="preserve"> No Swift toolchain exists on the build host, so</w:t>
+        <w:t>Both jobs are green</w:t>
+      </w:r>
+      <w:r>
+        <w:t xml:space="preserve"> (run</w:t>
       </w:r>
     </w:p>
     <w:p>
       <w:r>
-        <w:t>the HealthKit additions were reviewed by reading and validated structurally (balanced</w:t>
-      </w:r>
-    </w:p>
-    <w:p>
-      <w:r>
-        <w:t xml:space="preserve">scopes, single completion path through the </w:t>
+        <w:t>[</w:t>
       </w:r>
       <w:r>
         <w:rPr>
@@ -13075,67 +13070,10 @@
           <w:color w:val="1F2328"/>
           <w:sz w:val="18"/>
         </w:rPr>
-        <w:t>DispatchGroup</w:t>
-      </w:r>
-      <w:r>
-        <w:t>) — not compiled here.</w:t>
-      </w:r>
-    </w:p>
-    <w:p>
-      <w:pPr>
-        <w:pStyle w:val="ListBullet"/>
-      </w:pPr>
-      <w:r>
-        <w:rPr>
-          <w:b/>
-        </w:rPr>
-        <w:t>No device.</w:t>
-      </w:r>
-      <w:r>
-        <w:t xml:space="preserve"> The APK has still never run on a Pixel 9. Everything D-04/D-12/D-13,</w:t>
-      </w:r>
-    </w:p>
-    <w:p>
-      <w:r>
-        <w:t>real Health Connect provider behaviour, and the hotspot round trip from an actual</w:t>
-      </w:r>
-    </w:p>
-    <w:p>
-      <w:r>
-        <w:t>Apple Watch remains unverified.</w:t>
-      </w:r>
-    </w:p>
-    <w:p>
-      <w:pPr>
-        <w:pStyle w:val="ListBullet"/>
-      </w:pPr>
-      <w:r>
-        <w:rPr>
-          <w:b/>
-        </w:rPr>
-        <w:t>UI is compile-verified, not rendered.</w:t>
-      </w:r>
-      <w:r>
-        <w:t xml:space="preserve"> The token card and endpoint card are</w:t>
-      </w:r>
-    </w:p>
-    <w:p>
-      <w:r>
-        <w:t>checked by the Kotlin compiler and lint; no screenshot or instrumentation test exists.</w:t>
-      </w:r>
-    </w:p>
-    <w:p>
-      <w:pPr>
-        <w:pStyle w:val="ListBullet"/>
-      </w:pPr>
-      <w:r>
-        <w:rPr>
-          <w:b/>
-        </w:rPr>
-        <w:t>The XcodeGen spec is schema-checked, not executed.</w:t>
-      </w:r>
-      <w:r>
-        <w:t xml:space="preserve"> Only a macOS runner can prove</w:t>
+        <w:t>38875213993</w:t>
+      </w:r>
+      <w:r>
+        <w:t>](https://github.com/darknight11ish/AW9-Pixel-Bridge/actions/runs/38875213993)):</w:t>
       </w:r>
     </w:p>
     <w:p>
@@ -13145,10 +13083,28 @@
           <w:color w:val="1F2328"/>
           <w:sz w:val="18"/>
         </w:rPr>
-        <w:t>xcodegen generate</w:t>
-      </w:r>
-      <w:r>
-        <w:t xml:space="preserve"> + </w:t>
+        <w:t>build-and-test</w:t>
+      </w:r>
+      <w:r>
+        <w:t xml:space="preserve"> passed the JUnit suite, Android Lint, and both APK assemblies, and</w:t>
+      </w:r>
+    </w:p>
+    <w:p>
+      <w:r>
+        <w:rPr>
+          <w:rFonts w:ascii="Consolas" w:hAnsi="Consolas"/>
+          <w:color w:val="1F2328"/>
+          <w:sz w:val="18"/>
+        </w:rPr>
+        <w:t>watchos-companion-typecheck</w:t>
+      </w:r>
+      <w:r>
+        <w:t xml:space="preserve"> installed XcodeGen, generated the project, type-checked the</w:t>
+      </w:r>
+    </w:p>
+    <w:p>
+      <w:r>
+        <w:t xml:space="preserve">Swift against the watchOS SDK, and built the generated project with </w:t>
       </w:r>
       <w:r>
         <w:rPr>
@@ -13159,12 +13115,386 @@
         <w:t>xcodebuild</w:t>
       </w:r>
       <w:r>
-        <w:t xml:space="preserve"> succeed, which is why the CI job now installs</w:t>
+        <w:t>.</w:t>
       </w:r>
     </w:p>
     <w:p>
       <w:r>
-        <w:t>XcodeGen instead of silently skipping it.</w:t>
+        <w:t>Getting there took three iterations, and every fix came from CI rather than from local</w:t>
+      </w:r>
+    </w:p>
+    <w:p>
+      <w:r>
+        <w:t>runs:</w:t>
+      </w:r>
+    </w:p>
+    <w:p>
+      <w:pPr>
+        <w:pStyle w:val="ListNumber"/>
+      </w:pPr>
+      <w:r>
+        <w:rPr>
+          <w:b/>
+        </w:rPr>
+        <w:t>The HTTP test helper depended on connection-close timing.</w:t>
+      </w:r>
+      <w:r>
+        <w:t xml:space="preserve"> It read the response</w:t>
+      </w:r>
+    </w:p>
+    <w:p>
+      <w:r>
+        <w:t xml:space="preserve">with </w:t>
+      </w:r>
+      <w:r>
+        <w:rPr>
+          <w:rFonts w:ascii="Consolas" w:hAnsi="Consolas"/>
+          <w:color w:val="1F2328"/>
+          <w:sz w:val="18"/>
+        </w:rPr>
+        <w:t>BufferedReader.readText()</w:t>
+      </w:r>
+      <w:r>
+        <w:t>, which only returns when the server closes the</w:t>
+      </w:r>
+    </w:p>
+    <w:p>
+      <w:r>
+        <w:t>socket. That passed repeatedly on the Windows host and timed out on the Ubuntu</w:t>
+      </w:r>
+    </w:p>
+    <w:p>
+      <w:r>
+        <w:t>runner. The helper now parses the status line and headers and reads exactly</w:t>
+      </w:r>
+    </w:p>
+    <w:p>
+      <w:r>
+        <w:rPr>
+          <w:rFonts w:ascii="Consolas" w:hAnsi="Consolas"/>
+          <w:color w:val="1F2328"/>
+          <w:sz w:val="18"/>
+        </w:rPr>
+        <w:t>Content-Length</w:t>
+      </w:r>
+      <w:r>
+        <w:t xml:space="preserve"> bytes — what an HTTP client should do — and retries connection or</w:t>
+      </w:r>
+    </w:p>
+    <w:p>
+      <w:r>
+        <w:t>read timeouts only, so an incorrect response still fails the assertions.</w:t>
+      </w:r>
+    </w:p>
+    <w:p>
+      <w:pPr>
+        <w:pStyle w:val="ListNumber"/>
+      </w:pPr>
+      <w:r>
+        <w:rPr>
+          <w:b/>
+        </w:rPr>
+        <w:t>The document's XcodeGen guard would have been a permanent silent no-op.</w:t>
+      </w:r>
+      <w:r>
+        <w:t xml:space="preserve"> XcodeGen</w:t>
+      </w:r>
+    </w:p>
+    <w:p>
+      <w:r>
+        <w:t xml:space="preserve">is *not* installed on the </w:t>
+      </w:r>
+      <w:r>
+        <w:rPr>
+          <w:rFonts w:ascii="Consolas" w:hAnsi="Consolas"/>
+          <w:color w:val="1F2328"/>
+          <w:sz w:val="18"/>
+        </w:rPr>
+        <w:t>macos-14</w:t>
+      </w:r>
+      <w:r>
+        <w:t xml:space="preserve"> image (verified against </w:t>
+      </w:r>
+      <w:r>
+        <w:rPr>
+          <w:rFonts w:ascii="Consolas" w:hAnsi="Consolas"/>
+          <w:color w:val="1F2328"/>
+          <w:sz w:val="18"/>
+        </w:rPr>
+        <w:t>actions/runner-images</w:t>
+      </w:r>
+    </w:p>
+    <w:p>
+      <w:r>
+        <w:rPr>
+          <w:rFonts w:ascii="Consolas" w:hAnsi="Consolas"/>
+          <w:color w:val="1F2328"/>
+          <w:sz w:val="18"/>
+        </w:rPr>
+        <w:t>toolset-14.json</w:t>
+      </w:r>
+      <w:r>
+        <w:t xml:space="preserve">, whose </w:t>
+      </w:r>
+      <w:r>
+        <w:rPr>
+          <w:rFonts w:ascii="Consolas" w:hAnsi="Consolas"/>
+          <w:color w:val="1F2328"/>
+          <w:sz w:val="18"/>
+        </w:rPr>
+        <w:t>common_packages</w:t>
+      </w:r>
+      <w:r>
+        <w:t xml:space="preserve"> does not list it), so the specified</w:t>
+      </w:r>
+    </w:p>
+    <w:p>
+      <w:r>
+        <w:rPr>
+          <w:rFonts w:ascii="Consolas" w:hAnsi="Consolas"/>
+          <w:color w:val="1F2328"/>
+          <w:sz w:val="18"/>
+        </w:rPr>
+        <w:t>if command -v xcodegen … fi</w:t>
+      </w:r>
+      <w:r>
+        <w:t xml:space="preserve"> step would have skipped forever and never validated</w:t>
+      </w:r>
+    </w:p>
+    <w:p>
+      <w:r>
+        <w:rPr>
+          <w:rFonts w:ascii="Consolas" w:hAnsi="Consolas"/>
+          <w:color w:val="1F2328"/>
+          <w:sz w:val="18"/>
+        </w:rPr>
+        <w:t>project.yml</w:t>
+      </w:r>
+      <w:r>
+        <w:t>. The job now installs a pinned version and fails if generation does not</w:t>
+      </w:r>
+    </w:p>
+    <w:p>
+      <w:r>
+        <w:t>produce the project.</w:t>
+      </w:r>
+    </w:p>
+    <w:p>
+      <w:pPr>
+        <w:pStyle w:val="ListNumber"/>
+      </w:pPr>
+      <w:r>
+        <w:rPr>
+          <w:b/>
+        </w:rPr>
+        <w:t>XcodeGen 2.44+ and Xcode 15 do not interoperate.</w:t>
+      </w:r>
+      <w:r>
+        <w:t xml:space="preserve"> Current XcodeGen emits</w:t>
+      </w:r>
+    </w:p>
+    <w:p>
+      <w:r>
+        <w:rPr>
+          <w:rFonts w:ascii="Consolas" w:hAnsi="Consolas"/>
+          <w:color w:val="1F2328"/>
+          <w:sz w:val="18"/>
+        </w:rPr>
+        <w:t>objectVersion 77</w:t>
+      </w:r>
+      <w:r>
+        <w:t xml:space="preserve"> (the Xcode 16 project format); the runner's Xcode 15.4 refuses to</w:t>
+      </w:r>
+    </w:p>
+    <w:p>
+      <w:r>
+        <w:t>open it at all — *"cannot be opened because it is in a future Xcode project file</w:t>
+      </w:r>
+    </w:p>
+    <w:p>
+      <w:r>
+        <w:t xml:space="preserve">format (77)"*. Measured on the runner: **neither </w:t>
+      </w:r>
+      <w:r>
+        <w:rPr>
+          <w:rFonts w:ascii="Consolas" w:hAnsi="Consolas"/>
+          <w:color w:val="1F2328"/>
+          <w:sz w:val="18"/>
+        </w:rPr>
+        <w:t>options.objectVersion</w:t>
+      </w:r>
+      <w:r>
+        <w:t xml:space="preserve"> nor</w:t>
+      </w:r>
+    </w:p>
+    <w:p>
+      <w:r>
+        <w:rPr>
+          <w:rFonts w:ascii="Consolas" w:hAnsi="Consolas"/>
+          <w:color w:val="1F2328"/>
+          <w:sz w:val="18"/>
+        </w:rPr>
+        <w:t>options.compatibilityVersion</w:t>
+      </w:r>
+      <w:r>
+        <w:t xml:space="preserve"> in </w:t>
+      </w:r>
+      <w:r>
+        <w:rPr>
+          <w:rFonts w:ascii="Consolas" w:hAnsi="Consolas"/>
+          <w:color w:val="1F2328"/>
+          <w:sz w:val="18"/>
+        </w:rPr>
+        <w:t>project.yml</w:t>
+      </w:r>
+      <w:r>
+        <w:t xml:space="preserve"> changes the emitted value.** The</w:t>
+      </w:r>
+    </w:p>
+    <w:p>
+      <w:r>
+        <w:t xml:space="preserve">supported lever is the generator version, so CI pins XcodeGen </w:t>
+      </w:r>
+      <w:r>
+        <w:rPr>
+          <w:b/>
+        </w:rPr>
+        <w:t>2.43.0</w:t>
+      </w:r>
+      <w:r>
+        <w:t xml:space="preserve"> from the</w:t>
+      </w:r>
+    </w:p>
+    <w:p>
+      <w:r>
+        <w:t xml:space="preserve">official release asset, and the step reads the generated </w:t>
+      </w:r>
+      <w:r>
+        <w:rPr>
+          <w:rFonts w:ascii="Consolas" w:hAnsi="Consolas"/>
+          <w:color w:val="1F2328"/>
+          <w:sz w:val="18"/>
+        </w:rPr>
+        <w:t>objectVersion</w:t>
+      </w:r>
+      <w:r>
+        <w:t xml:space="preserve"> back and</w:t>
+      </w:r>
+    </w:p>
+    <w:p>
+      <w:r>
+        <w:t>fails explicitly if it is ever too new again.</w:t>
+      </w:r>
+    </w:p>
+    <w:p>
+      <w:r>
+        <w:t>Two of those (1 and 3) are exactly the class of defect this repository's own process</w:t>
+      </w:r>
+    </w:p>
+    <w:p>
+      <w:r>
+        <w:t>notes call out: they were invisible to reading, invisible locally, and only a target</w:t>
+      </w:r>
+    </w:p>
+    <w:p>
+      <w:r>
+        <w:t>environment could expose them.</w:t>
+      </w:r>
+    </w:p>
+    <w:p>
+      <w:pPr>
+        <w:pStyle w:val="Heading2"/>
+      </w:pPr>
+      <w:r>
+        <w:t>12.5 Honest limits of this verification</w:t>
+      </w:r>
+    </w:p>
+    <w:p>
+      <w:pPr>
+        <w:pStyle w:val="ListBullet"/>
+      </w:pPr>
+      <w:r>
+        <w:rPr>
+          <w:b/>
+        </w:rPr>
+        <w:t>No device.</w:t>
+      </w:r>
+      <w:r>
+        <w:t xml:space="preserve"> The APK has still never run on a Pixel 9. Everything D-04/D-12/D-13,</w:t>
+      </w:r>
+    </w:p>
+    <w:p>
+      <w:r>
+        <w:t>real Health Connect provider behaviour, and the hotspot round trip from an actual</w:t>
+      </w:r>
+    </w:p>
+    <w:p>
+      <w:r>
+        <w:t>Apple Watch remains unverified. CI proves the code compiles, lints, and passes its</w:t>
+      </w:r>
+    </w:p>
+    <w:p>
+      <w:r>
+        <w:t>own tests — not that it works on hardware.</w:t>
+      </w:r>
+    </w:p>
+    <w:p>
+      <w:pPr>
+        <w:pStyle w:val="ListBullet"/>
+      </w:pPr>
+      <w:r>
+        <w:rPr>
+          <w:b/>
+        </w:rPr>
+        <w:t>UI is compile-verified, not rendered.</w:t>
+      </w:r>
+      <w:r>
+        <w:t xml:space="preserve"> The token card and endpoint card are checked</w:t>
+      </w:r>
+    </w:p>
+    <w:p>
+      <w:r>
+        <w:t>by the Kotlin compiler and lint; no screenshot or instrumentation test exists.</w:t>
+      </w:r>
+    </w:p>
+    <w:p>
+      <w:pPr>
+        <w:pStyle w:val="ListBullet"/>
+      </w:pPr>
+      <w:r>
+        <w:rPr>
+          <w:b/>
+        </w:rPr>
+        <w:t>Swift is verified by a type-check and a signed-less build only.</w:t>
+      </w:r>
+      <w:r>
+        <w:t xml:space="preserve"> CI compiles the</w:t>
+      </w:r>
+    </w:p>
+    <w:p>
+      <w:r>
+        <w:t xml:space="preserve">file and builds the generated project with </w:t>
+      </w:r>
+      <w:r>
+        <w:rPr>
+          <w:rFonts w:ascii="Consolas" w:hAnsi="Consolas"/>
+          <w:color w:val="1F2328"/>
+          <w:sz w:val="18"/>
+        </w:rPr>
+        <w:t>CODE_SIGNING_ALLOWED=NO</w:t>
+      </w:r>
+      <w:r>
+        <w:t>; it does not</w:t>
+      </w:r>
+    </w:p>
+    <w:p>
+      <w:r>
+        <w:t>install or run on a watch, and XcodeGen is pinned to an older release because of the</w:t>
+      </w:r>
+    </w:p>
+    <w:p>
+      <w:r>
+        <w:t>format incompatibility documented in §12.4.</w:t>
       </w:r>
     </w:p>
     <w:sectPr>

</xml_diff>

<commit_message>
docs(report): record the three consecutive green CI runs
The test-reuse fix in eefedba is confirmed stable: run 38875985814 plus two
workflow_dispatch runs (38876269755, 38876650657) are all fully green on both jobs,
including the xcodebuild step. Section 12.4 now cites all three runs and explains why a
single green run was not sufficient evidence for an intermittent defect. The .docx is
regenerated from the .md.
</commit_message>
<xml_diff>
--- a/docs/AW9_PIXEL_BRIDGE_ENGAGEMENT_REPORT.docx
+++ b/docs/AW9_PIXEL_BRIDGE_ENGAGEMENT_REPORT.docx
@@ -13048,21 +13048,12 @@
     </w:p>
     <w:p>
       <w:r>
-        <w:t xml:space="preserve">The v1.1.0 push ran the real workflow. </w:t>
-      </w:r>
-      <w:r>
-        <w:rPr>
-          <w:b/>
-        </w:rPr>
-        <w:t>Both jobs are green</w:t>
-      </w:r>
-      <w:r>
-        <w:t xml:space="preserve"> (run</w:t>
+        <w:t>The v1.1.0 push ran the real workflow. **Both jobs are green, on three consecutive</w:t>
       </w:r>
     </w:p>
     <w:p>
       <w:r>
-        <w:t>[</w:t>
+        <w:t>runs** ([</w:t>
       </w:r>
       <w:r>
         <w:rPr>
@@ -13070,10 +13061,42 @@
           <w:color w:val="1F2328"/>
           <w:sz w:val="18"/>
         </w:rPr>
-        <w:t>38875213993</w:t>
-      </w:r>
-      <w:r>
-        <w:t>](https://github.com/darknight11ish/AW9-Pixel-Bridge/actions/runs/38875213993)):</w:t>
+        <w:t>38875985814</w:t>
+      </w:r>
+      <w:r>
+        <w:t>](https://github.com/darknight11ish/AW9-Pixel-Bridge/actions/runs/38875985814),</w:t>
+      </w:r>
+    </w:p>
+    <w:p>
+      <w:r>
+        <w:t>[</w:t>
+      </w:r>
+      <w:r>
+        <w:rPr>
+          <w:rFonts w:ascii="Consolas" w:hAnsi="Consolas"/>
+          <w:color w:val="1F2328"/>
+          <w:sz w:val="18"/>
+        </w:rPr>
+        <w:t>38876269755</w:t>
+      </w:r>
+      <w:r>
+        <w:t>](https://github.com/darknight11ish/AW9-Pixel-Bridge/actions/runs/38876269755),</w:t>
+      </w:r>
+    </w:p>
+    <w:p>
+      <w:r>
+        <w:t>[</w:t>
+      </w:r>
+      <w:r>
+        <w:rPr>
+          <w:rFonts w:ascii="Consolas" w:hAnsi="Consolas"/>
+          <w:color w:val="1F2328"/>
+          <w:sz w:val="18"/>
+        </w:rPr>
+        <w:t>38876650657</w:t>
+      </w:r>
+      <w:r>
+        <w:t>](https://github.com/darknight11ish/AW9-Pixel-Bridge/actions/runs/38876650657)):</w:t>
       </w:r>
     </w:p>
     <w:p>
@@ -13115,12 +13138,22 @@
         <w:t>xcodebuild</w:t>
       </w:r>
       <w:r>
-        <w:t>.</w:t>
+        <w:t>. The</w:t>
       </w:r>
     </w:p>
     <w:p>
       <w:r>
-        <w:t>Getting there took three iterations, and every fix came from CI rather than from local</w:t>
+        <w:t>three-run confirmation exists because the first defect below was intermittent, and a</w:t>
+      </w:r>
+    </w:p>
+    <w:p>
+      <w:r>
+        <w:t>single green run would not have proven it fixed.</w:t>
+      </w:r>
+    </w:p>
+    <w:p>
+      <w:r>
+        <w:t>Getting there took four iterations, and every fix came from CI rather than from local</w:t>
       </w:r>
     </w:p>
     <w:p>
@@ -13178,12 +13211,38 @@
         <w:t>Content-Length</w:t>
       </w:r>
       <w:r>
-        <w:t xml:space="preserve"> bytes — what an HTTP client should do — and retries connection or</w:t>
+        <w:t xml:space="preserve"> bytes — what an HTTP client should do. When the failure then moved</w:t>
       </w:r>
     </w:p>
     <w:p>
       <w:r>
-        <w:t>read timeouts only, so an incorrect response still fails the assertions.</w:t>
+        <w:t>to *the second request in a test*, the class was restructured to start one listener on</w:t>
+      </w:r>
+    </w:p>
+    <w:p>
+      <w:r>
+        <w:t>an ephemeral port (</w:t>
+      </w:r>
+      <w:r>
+        <w:rPr>
+          <w:rFonts w:ascii="Consolas" w:hAnsi="Consolas"/>
+          <w:color w:val="1F2328"/>
+          <w:sz w:val="18"/>
+        </w:rPr>
+        <w:t>startLocalHttpServer(0)</w:t>
+      </w:r>
+      <w:r>
+        <w:t>) and reuse it, with the whole client</w:t>
+      </w:r>
+    </w:p>
+    <w:p>
+      <w:r>
+        <w:t>interaction retried a bounded number of times. Assertions stayed strict; only the</w:t>
+      </w:r>
+    </w:p>
+    <w:p>
+      <w:r>
+        <w:t>timing sensitivity was removed.</w:t>
       </w:r>
     </w:p>
     <w:p>
@@ -13388,17 +13447,27 @@
     </w:p>
     <w:p>
       <w:r>
-        <w:t>Two of those (1 and 3) are exactly the class of defect this repository's own process</w:t>
+        <w:t>Defects 1 and 3 are exactly the class of problem this repository's own process notes</w:t>
       </w:r>
     </w:p>
     <w:p>
       <w:r>
-        <w:t>notes call out: they were invisible to reading, invisible locally, and only a target</w:t>
+        <w:t>call out: invisible to reading, invisible locally, and only a target environment could</w:t>
       </w:r>
     </w:p>
     <w:p>
       <w:r>
-        <w:t>environment could expose them.</w:t>
+        <w:t>expose them. Defect 2 is the more interesting one — the specified instruction was itself</w:t>
+      </w:r>
+    </w:p>
+    <w:p>
+      <w:r>
+        <w:t>the bug, and following it as written would have produced a check that permanently</w:t>
+      </w:r>
+    </w:p>
+    <w:p>
+      <w:r>
+        <w:t>reported success while verifying nothing.</w:t>
       </w:r>
     </w:p>
     <w:p>

</xml_diff>

<commit_message>
docs(report): refresh the v1.1.0 metrics after the README section
Reproduced with scripts/verify_repo_metrics.py: 41 tracked files / 732,814 bytes, up from
40 / 709,724 with the plain-language README section added. The Word companion is
regenerated from the Markdown.
</commit_message>
<xml_diff>
--- a/docs/AW9_PIXEL_BRIDGE_ENGAGEMENT_REPORT.docx
+++ b/docs/AW9_PIXEL_BRIDGE_ENGAGEMENT_REPORT.docx
@@ -1380,7 +1380,7 @@
               <w:rPr>
                 <w:sz w:val="18"/>
               </w:rPr>
-              <w:t>40</w:t>
+              <w:t>41</w:t>
             </w:r>
           </w:p>
         </w:tc>
@@ -1398,7 +1398,7 @@
               <w:rPr>
                 <w:sz w:val="18"/>
               </w:rPr>
-              <w:t>709,724</w:t>
+              <w:t>732,814</w:t>
             </w:r>
           </w:p>
         </w:tc>
@@ -12956,6 +12956,84 @@
                 <w:sz w:val="18"/>
               </w:rPr>
               <w:t>40 files / 709,724 B</w:t>
+            </w:r>
+          </w:p>
+        </w:tc>
+        <w:tc>
+          <w:tcPr>
+            <w:tcW w:type="dxa" w:w="2880"/>
+          </w:tcPr>
+          <w:p>
+            <w:r>
+              <w:rPr>
+                <w:sz w:val="18"/>
+              </w:rPr>
+            </w:r>
+            <w:r>
+              <w:rPr>
+                <w:sz w:val="18"/>
+              </w:rPr>
+              <w:t>—</w:t>
+            </w:r>
+          </w:p>
+        </w:tc>
+      </w:tr>
+      <w:tr>
+        <w:tc>
+          <w:tcPr>
+            <w:tcW w:type="dxa" w:w="2880"/>
+          </w:tcPr>
+          <w:p>
+            <w:r>
+              <w:rPr>
+                <w:sz w:val="18"/>
+              </w:rPr>
+            </w:r>
+            <w:r>
+              <w:rPr>
+                <w:rFonts w:ascii="Consolas" w:hAnsi="Consolas"/>
+                <w:color w:val="1F2328"/>
+                <w:sz w:val="18"/>
+              </w:rPr>
+              <w:t>v1.1.0</w:t>
+            </w:r>
+            <w:r>
+              <w:rPr>
+                <w:sz w:val="18"/>
+              </w:rPr>
+              <w:t xml:space="preserve"> final (</w:t>
+            </w:r>
+            <w:r>
+              <w:rPr>
+                <w:rFonts w:ascii="Consolas" w:hAnsi="Consolas"/>
+                <w:color w:val="1F2328"/>
+                <w:sz w:val="18"/>
+              </w:rPr>
+              <w:t>5fec663</w:t>
+            </w:r>
+            <w:r>
+              <w:rPr>
+                <w:sz w:val="18"/>
+              </w:rPr>
+              <w:t>, + README plain-language section)</w:t>
+            </w:r>
+          </w:p>
+        </w:tc>
+        <w:tc>
+          <w:tcPr>
+            <w:tcW w:type="dxa" w:w="2880"/>
+          </w:tcPr>
+          <w:p>
+            <w:r>
+              <w:rPr>
+                <w:sz w:val="18"/>
+              </w:rPr>
+            </w:r>
+            <w:r>
+              <w:rPr>
+                <w:sz w:val="18"/>
+              </w:rPr>
+              <w:t>41 files / 732,814 B</w:t>
             </w:r>
           </w:p>
         </w:tc>

</xml_diff>

<commit_message>
docs(report): record the v1.2.0 round in section 13
Documents the four PRs, which of the four prescribed workstreams were already delivered
in v1.1.0 (WS1 task 1, all of WS4) and how each was reduced to the part genuinely
missing, plus the four real defects this round found: the unbounded permit wait behind
the concurrency cap, the SIGPIPE that was killing xcodebuild inside a check added in the
previous round, the invisible HealthKit query failures on the watch, and the XcodeGen
project contract that nothing asserted. Also records the SpO2 test that failed because
the *test* was wrong, and the unit contract it clarified.

The Word companion is regenerated from the Markdown.
</commit_message>
<xml_diff>
--- a/docs/AW9_PIXEL_BRIDGE_ENGAGEMENT_REPORT.docx
+++ b/docs/AW9_PIXEL_BRIDGE_ENGAGEMENT_REPORT.docx
@@ -13642,6 +13642,1623 @@
     <w:p>
       <w:r>
         <w:t>format incompatibility documented in §12.4.</w:t>
+      </w:r>
+    </w:p>
+    <w:p>
+      <w:pPr>
+        <w:jc w:val="center"/>
+      </w:pPr>
+      <w:r>
+        <w:rPr>
+          <w:color w:val="888888"/>
+          <w:sz w:val="18"/>
+        </w:rPr>
+        <w:t>• • •</w:t>
+      </w:r>
+    </w:p>
+    <w:p>
+      <w:pPr>
+        <w:pStyle w:val="Heading1"/>
+      </w:pPr>
+      <w:r>
+        <w:t>13. `v1.2.0` — four PRs built, CI-verified and merged</w:t>
+      </w:r>
+    </w:p>
+    <w:p>
+      <w:r>
+        <w:t>The follow-up brief prescribed four workstreams, open PRs, self-heal CI, merge when</w:t>
+      </w:r>
+    </w:p>
+    <w:p>
+      <w:r>
+        <w:t xml:space="preserve">green, then release </w:t>
+      </w:r>
+      <w:r>
+        <w:rPr>
+          <w:rFonts w:ascii="Consolas" w:hAnsi="Consolas"/>
+          <w:color w:val="1F2328"/>
+          <w:sz w:val="18"/>
+        </w:rPr>
+        <w:t>v1.2.0</w:t>
+      </w:r>
+      <w:r>
+        <w:t xml:space="preserve">. It also instructed merging to </w:t>
+      </w:r>
+      <w:r>
+        <w:rPr>
+          <w:rFonts w:ascii="Consolas" w:hAnsi="Consolas"/>
+          <w:color w:val="1F2328"/>
+          <w:sz w:val="18"/>
+        </w:rPr>
+        <w:t>main</w:t>
+      </w:r>
+      <w:r>
+        <w:t xml:space="preserve"> </w:t>
+      </w:r>
+      <w:r>
+        <w:rPr>
+          <w:b/>
+        </w:rPr>
+        <w:t>before</w:t>
+      </w:r>
+      <w:r>
+        <w:t xml:space="preserve"> opening the</w:t>
+      </w:r>
+    </w:p>
+    <w:p>
+      <w:r>
+        <w:t>PRs, which — as established in the previous round — makes the PRs unopenable. I ran the</w:t>
+      </w:r>
+    </w:p>
+    <w:p>
+      <w:r>
+        <w:t>loop in the order the CI triggers actually require (push → open PR → watch checks →</w:t>
+      </w:r>
+    </w:p>
+    <w:p>
+      <w:r>
+        <w:t>squash-merge), and this is the first round in which **all four PRs were opened, watched</w:t>
+      </w:r>
+    </w:p>
+    <w:p>
+      <w:r>
+        <w:t>green, and squash-merged** rather than merged first and recorded afterwards.</w:t>
+      </w:r>
+    </w:p>
+    <w:tbl>
+      <w:tblPr>
+        <w:tblStyle w:val="TableGrid"/>
+        <w:tblW w:type="auto" w:w="0"/>
+        <w:tblLook w:firstColumn="1" w:firstRow="1" w:lastColumn="0" w:lastRow="0" w:noHBand="0" w:noVBand="1" w:val="04A0"/>
+      </w:tblPr>
+      <w:tblGrid>
+        <w:gridCol w:w="2160"/>
+        <w:gridCol w:w="2160"/>
+        <w:gridCol w:w="2160"/>
+        <w:gridCol w:w="2160"/>
+      </w:tblGrid>
+      <w:tr>
+        <w:tc>
+          <w:tcPr>
+            <w:tcW w:type="dxa" w:w="2160"/>
+          </w:tcPr>
+          <w:p>
+            <w:r>
+              <w:rPr>
+                <w:b/>
+                <w:sz w:val="18"/>
+              </w:rPr>
+            </w:r>
+            <w:r>
+              <w:rPr>
+                <w:b/>
+                <w:sz w:val="18"/>
+              </w:rPr>
+              <w:t>PR</w:t>
+            </w:r>
+          </w:p>
+        </w:tc>
+        <w:tc>
+          <w:tcPr>
+            <w:tcW w:type="dxa" w:w="2160"/>
+          </w:tcPr>
+          <w:p>
+            <w:r>
+              <w:rPr>
+                <w:b/>
+                <w:sz w:val="18"/>
+              </w:rPr>
+            </w:r>
+            <w:r>
+              <w:rPr>
+                <w:b/>
+                <w:sz w:val="18"/>
+              </w:rPr>
+              <w:t>Branch</w:t>
+            </w:r>
+          </w:p>
+        </w:tc>
+        <w:tc>
+          <w:tcPr>
+            <w:tcW w:type="dxa" w:w="2160"/>
+          </w:tcPr>
+          <w:p>
+            <w:r>
+              <w:rPr>
+                <w:b/>
+                <w:sz w:val="18"/>
+              </w:rPr>
+            </w:r>
+            <w:r>
+              <w:rPr>
+                <w:b/>
+                <w:sz w:val="18"/>
+              </w:rPr>
+              <w:t>Squash commit</w:t>
+            </w:r>
+          </w:p>
+        </w:tc>
+        <w:tc>
+          <w:tcPr>
+            <w:tcW w:type="dxa" w:w="2160"/>
+          </w:tcPr>
+          <w:p>
+            <w:r>
+              <w:rPr>
+                <w:b/>
+                <w:sz w:val="18"/>
+              </w:rPr>
+            </w:r>
+            <w:r>
+              <w:rPr>
+                <w:b/>
+                <w:sz w:val="18"/>
+              </w:rPr>
+              <w:t>Scope</w:t>
+            </w:r>
+          </w:p>
+        </w:tc>
+      </w:tr>
+      <w:tr>
+        <w:tc>
+          <w:tcPr>
+            <w:tcW w:type="dxa" w:w="2160"/>
+          </w:tcPr>
+          <w:p>
+            <w:r>
+              <w:rPr>
+                <w:sz w:val="18"/>
+              </w:rPr>
+            </w:r>
+            <w:r>
+              <w:rPr>
+                <w:sz w:val="18"/>
+              </w:rPr>
+              <w:t>[#1](https://github.com/darknight11ish/AW9-Pixel-Bridge/pull/1)</w:t>
+            </w:r>
+          </w:p>
+        </w:tc>
+        <w:tc>
+          <w:tcPr>
+            <w:tcW w:type="dxa" w:w="2160"/>
+          </w:tcPr>
+          <w:p>
+            <w:r>
+              <w:rPr>
+                <w:sz w:val="18"/>
+              </w:rPr>
+            </w:r>
+            <w:r>
+              <w:rPr>
+                <w:rFonts w:ascii="Consolas" w:hAnsi="Consolas"/>
+                <w:color w:val="1F2328"/>
+                <w:sz w:val="18"/>
+              </w:rPr>
+              <w:t>feat/hotspot-ip-auto-refresh</w:t>
+            </w:r>
+          </w:p>
+        </w:tc>
+        <w:tc>
+          <w:tcPr>
+            <w:tcW w:type="dxa" w:w="2160"/>
+          </w:tcPr>
+          <w:p>
+            <w:r>
+              <w:rPr>
+                <w:sz w:val="18"/>
+              </w:rPr>
+            </w:r>
+            <w:r>
+              <w:rPr>
+                <w:rFonts w:ascii="Consolas" w:hAnsi="Consolas"/>
+                <w:color w:val="1F2328"/>
+                <w:sz w:val="18"/>
+              </w:rPr>
+              <w:t>7528183</w:t>
+            </w:r>
+          </w:p>
+        </w:tc>
+        <w:tc>
+          <w:tcPr>
+            <w:tcW w:type="dxa" w:w="2160"/>
+          </w:tcPr>
+          <w:p>
+            <w:r>
+              <w:rPr>
+                <w:sz w:val="18"/>
+              </w:rPr>
+            </w:r>
+            <w:r>
+              <w:rPr>
+                <w:sz w:val="18"/>
+              </w:rPr>
+              <w:t>Endpoint enumeration + resume refresh</w:t>
+            </w:r>
+          </w:p>
+        </w:tc>
+      </w:tr>
+      <w:tr>
+        <w:tc>
+          <w:tcPr>
+            <w:tcW w:type="dxa" w:w="2160"/>
+          </w:tcPr>
+          <w:p>
+            <w:r>
+              <w:rPr>
+                <w:sz w:val="18"/>
+              </w:rPr>
+            </w:r>
+            <w:r>
+              <w:rPr>
+                <w:sz w:val="18"/>
+              </w:rPr>
+              <w:t>[#2](https://github.com/darknight11ish/AW9-Pixel-Bridge/pull/2)</w:t>
+            </w:r>
+          </w:p>
+        </w:tc>
+        <w:tc>
+          <w:tcPr>
+            <w:tcW w:type="dxa" w:w="2160"/>
+          </w:tcPr>
+          <w:p>
+            <w:r>
+              <w:rPr>
+                <w:sz w:val="18"/>
+              </w:rPr>
+            </w:r>
+            <w:r>
+              <w:rPr>
+                <w:rFonts w:ascii="Consolas" w:hAnsi="Consolas"/>
+                <w:color w:val="1F2328"/>
+                <w:sz w:val="18"/>
+              </w:rPr>
+              <w:t>feat/http-server-concurrency-hardening</w:t>
+            </w:r>
+          </w:p>
+        </w:tc>
+        <w:tc>
+          <w:tcPr>
+            <w:tcW w:type="dxa" w:w="2160"/>
+          </w:tcPr>
+          <w:p>
+            <w:r>
+              <w:rPr>
+                <w:sz w:val="18"/>
+              </w:rPr>
+            </w:r>
+            <w:r>
+              <w:rPr>
+                <w:rFonts w:ascii="Consolas" w:hAnsi="Consolas"/>
+                <w:color w:val="1F2328"/>
+                <w:sz w:val="18"/>
+              </w:rPr>
+              <w:t>96b5829</w:t>
+            </w:r>
+          </w:p>
+        </w:tc>
+        <w:tc>
+          <w:tcPr>
+            <w:tcW w:type="dxa" w:w="2160"/>
+          </w:tcPr>
+          <w:p>
+            <w:r>
+              <w:rPr>
+                <w:sz w:val="18"/>
+              </w:rPr>
+            </w:r>
+            <w:r>
+              <w:rPr>
+                <w:sz w:val="18"/>
+              </w:rPr>
+              <w:t>Bounded permit wait + 503 + concurrency test</w:t>
+            </w:r>
+          </w:p>
+        </w:tc>
+      </w:tr>
+      <w:tr>
+        <w:tc>
+          <w:tcPr>
+            <w:tcW w:type="dxa" w:w="2160"/>
+          </w:tcPr>
+          <w:p>
+            <w:r>
+              <w:rPr>
+                <w:sz w:val="18"/>
+              </w:rPr>
+            </w:r>
+            <w:r>
+              <w:rPr>
+                <w:sz w:val="18"/>
+              </w:rPr>
+              <w:t>[#3](https://github.com/darknight11ish/AW9-Pixel-Bridge/pull/3)</w:t>
+            </w:r>
+          </w:p>
+        </w:tc>
+        <w:tc>
+          <w:tcPr>
+            <w:tcW w:type="dxa" w:w="2160"/>
+          </w:tcPr>
+          <w:p>
+            <w:r>
+              <w:rPr>
+                <w:sz w:val="18"/>
+              </w:rPr>
+            </w:r>
+            <w:r>
+              <w:rPr>
+                <w:rFonts w:ascii="Consolas" w:hAnsi="Consolas"/>
+                <w:color w:val="1F2328"/>
+                <w:sz w:val="18"/>
+              </w:rPr>
+              <w:t>feat/comprehensive-health-sync-tests</w:t>
+            </w:r>
+          </w:p>
+        </w:tc>
+        <w:tc>
+          <w:tcPr>
+            <w:tcW w:type="dxa" w:w="2160"/>
+          </w:tcPr>
+          <w:p>
+            <w:r>
+              <w:rPr>
+                <w:sz w:val="18"/>
+              </w:rPr>
+            </w:r>
+            <w:r>
+              <w:rPr>
+                <w:rFonts w:ascii="Consolas" w:hAnsi="Consolas"/>
+                <w:color w:val="1F2328"/>
+                <w:sz w:val="18"/>
+              </w:rPr>
+              <w:t>3124b3f</w:t>
+            </w:r>
+          </w:p>
+        </w:tc>
+        <w:tc>
+          <w:tcPr>
+            <w:tcW w:type="dxa" w:w="2160"/>
+          </w:tcPr>
+          <w:p>
+            <w:r>
+              <w:rPr>
+                <w:sz w:val="18"/>
+              </w:rPr>
+            </w:r>
+            <w:r>
+              <w:rPr>
+                <w:sz w:val="18"/>
+              </w:rPr>
+              <w:t xml:space="preserve">Parser edge cases + </w:t>
+            </w:r>
+            <w:r>
+              <w:rPr>
+                <w:rFonts w:ascii="Consolas" w:hAnsi="Consolas"/>
+                <w:color w:val="1F2328"/>
+                <w:sz w:val="18"/>
+              </w:rPr>
+              <w:t>HealthConnectManagerTest</w:t>
+            </w:r>
+          </w:p>
+        </w:tc>
+      </w:tr>
+      <w:tr>
+        <w:tc>
+          <w:tcPr>
+            <w:tcW w:type="dxa" w:w="2160"/>
+          </w:tcPr>
+          <w:p>
+            <w:r>
+              <w:rPr>
+                <w:sz w:val="18"/>
+              </w:rPr>
+            </w:r>
+            <w:r>
+              <w:rPr>
+                <w:sz w:val="18"/>
+              </w:rPr>
+              <w:t>[#4](https://github.com/darknight11ish/AW9-Pixel-Bridge/pull/4)</w:t>
+            </w:r>
+          </w:p>
+        </w:tc>
+        <w:tc>
+          <w:tcPr>
+            <w:tcW w:type="dxa" w:w="2160"/>
+          </w:tcPr>
+          <w:p>
+            <w:r>
+              <w:rPr>
+                <w:sz w:val="18"/>
+              </w:rPr>
+            </w:r>
+            <w:r>
+              <w:rPr>
+                <w:rFonts w:ascii="Consolas" w:hAnsi="Consolas"/>
+                <w:color w:val="1F2328"/>
+                <w:sz w:val="18"/>
+              </w:rPr>
+              <w:t>feat/watchos-background-vitals-polish</w:t>
+            </w:r>
+          </w:p>
+        </w:tc>
+        <w:tc>
+          <w:tcPr>
+            <w:tcW w:type="dxa" w:w="2160"/>
+          </w:tcPr>
+          <w:p>
+            <w:r>
+              <w:rPr>
+                <w:sz w:val="18"/>
+              </w:rPr>
+            </w:r>
+            <w:r>
+              <w:rPr>
+                <w:rFonts w:ascii="Consolas" w:hAnsi="Consolas"/>
+                <w:color w:val="1F2328"/>
+                <w:sz w:val="18"/>
+              </w:rPr>
+              <w:t>9790f1a</w:t>
+            </w:r>
+          </w:p>
+        </w:tc>
+        <w:tc>
+          <w:tcPr>
+            <w:tcW w:type="dxa" w:w="2160"/>
+          </w:tcPr>
+          <w:p>
+            <w:r>
+              <w:rPr>
+                <w:sz w:val="18"/>
+              </w:rPr>
+            </w:r>
+            <w:r>
+              <w:rPr>
+                <w:sz w:val="18"/>
+              </w:rPr>
+              <w:t>Vitals failure surfacing + project contract CI</w:t>
+            </w:r>
+          </w:p>
+        </w:tc>
+      </w:tr>
+    </w:tbl>
+    <w:p/>
+    <w:p>
+      <w:pPr>
+        <w:pStyle w:val="Heading2"/>
+      </w:pPr>
+      <w:r>
+        <w:t>13.1 Two of the four workstreams were already done</w:t>
+      </w:r>
+    </w:p>
+    <w:p>
+      <w:r>
+        <w:t>The brief's Workstream 1 Task 1 (enumerate all active interfaces with labels) and</w:t>
+      </w:r>
+    </w:p>
+    <w:p>
+      <w:r>
+        <w:t xml:space="preserve">Workstream 4 Tasks 1–2 (background vitals polling, XcodeGen generation and </w:t>
+      </w:r>
+      <w:r>
+        <w:rPr>
+          <w:rFonts w:ascii="Consolas" w:hAnsi="Consolas"/>
+          <w:color w:val="1F2328"/>
+          <w:sz w:val="18"/>
+        </w:rPr>
+        <w:t>xcodebuild</w:t>
+      </w:r>
+    </w:p>
+    <w:p>
+      <w:r>
+        <w:t xml:space="preserve">verification) described work that </w:t>
+      </w:r>
+      <w:r>
+        <w:rPr>
+          <w:b/>
+        </w:rPr>
+        <w:t>v1.1.0 had already delivered and CI-verified</w:t>
+      </w:r>
+      <w:r>
+        <w:t>.</w:t>
+      </w:r>
+    </w:p>
+    <w:p>
+      <w:r>
+        <w:t>Workstream 2's exception handling was also already present. Re-implementing any of it</w:t>
+      </w:r>
+    </w:p>
+    <w:p>
+      <w:r>
+        <w:t>would have been churn, so each was reduced to the part that was genuinely missing:</w:t>
+      </w:r>
+    </w:p>
+    <w:p>
+      <w:pPr>
+        <w:pStyle w:val="ListBullet"/>
+      </w:pPr>
+      <w:r>
+        <w:rPr>
+          <w:b/>
+        </w:rPr>
+        <w:t>WS1</w:t>
+      </w:r>
+      <w:r>
+        <w:t xml:space="preserve"> — changed the separator to the </w:t>
+      </w:r>
+      <w:r>
+        <w:rPr>
+          <w:rFonts w:ascii="Consolas" w:hAnsi="Consolas"/>
+          <w:color w:val="1F2328"/>
+          <w:sz w:val="18"/>
+        </w:rPr>
+        <w:t>" | "</w:t>
+      </w:r>
+      <w:r>
+        <w:t xml:space="preserve"> form the brief specified, extracted two</w:t>
+      </w:r>
+    </w:p>
+    <w:p>
+      <w:r>
+        <w:t>pure helpers (</w:t>
+      </w:r>
+      <w:r>
+        <w:rPr>
+          <w:rFonts w:ascii="Consolas" w:hAnsi="Consolas"/>
+          <w:color w:val="1F2328"/>
+          <w:sz w:val="18"/>
+        </w:rPr>
+        <w:t>rankEndpoints</w:t>
+      </w:r>
+      <w:r>
+        <w:t xml:space="preserve">, </w:t>
+      </w:r>
+      <w:r>
+        <w:rPr>
+          <w:rFonts w:ascii="Consolas" w:hAnsi="Consolas"/>
+          <w:color w:val="1F2328"/>
+          <w:sz w:val="18"/>
+        </w:rPr>
+        <w:t>formatEndpoint</w:t>
+      </w:r>
+      <w:r>
+        <w:t>), and added the one real gap: an</w:t>
+      </w:r>
+    </w:p>
+    <w:p>
+      <w:r>
+        <w:rPr>
+          <w:rFonts w:ascii="Consolas" w:hAnsi="Consolas"/>
+          <w:color w:val="1F2328"/>
+          <w:sz w:val="18"/>
+        </w:rPr>
+        <w:t>ON_RESUME</w:t>
+      </w:r>
+      <w:r>
+        <w:t xml:space="preserve"> refresh, because Android may not deliver network callbacks that fired while</w:t>
+      </w:r>
+    </w:p>
+    <w:p>
+      <w:r>
+        <w:t>the process was backgrounded.</w:t>
+      </w:r>
+    </w:p>
+    <w:p>
+      <w:pPr>
+        <w:pStyle w:val="ListBullet"/>
+      </w:pPr>
+      <w:r>
+        <w:rPr>
+          <w:b/>
+        </w:rPr>
+        <w:t>WS2</w:t>
+      </w:r>
+      <w:r>
+        <w:t xml:space="preserve"> — kept the existing exception boundary and added the concurrency test, plus a</w:t>
+      </w:r>
+    </w:p>
+    <w:p>
+      <w:r>
+        <w:t>real defect it exposed (below).</w:t>
+      </w:r>
+    </w:p>
+    <w:p>
+      <w:pPr>
+        <w:pStyle w:val="ListBullet"/>
+      </w:pPr>
+      <w:r>
+        <w:rPr>
+          <w:b/>
+        </w:rPr>
+        <w:t>WS4</w:t>
+      </w:r>
+      <w:r>
+        <w:t xml:space="preserve"> — kept the existing polling and CI checks, and fixed two defects in them.</w:t>
+      </w:r>
+    </w:p>
+    <w:p>
+      <w:pPr>
+        <w:pStyle w:val="Heading2"/>
+      </w:pPr>
+      <w:r>
+        <w:t>13.2 The real defects found</w:t>
+      </w:r>
+    </w:p>
+    <w:p>
+      <w:pPr>
+        <w:pStyle w:val="ListNumber"/>
+      </w:pPr>
+      <w:r>
+        <w:rPr>
+          <w:b/>
+        </w:rPr>
+        <w:t>The concurrency cap had an unbounded wait behind it (WS2).</w:t>
+      </w:r>
+      <w:r>
+        <w:t xml:space="preserve"> </w:t>
+      </w:r>
+      <w:r>
+        <w:rPr>
+          <w:rFonts w:ascii="Consolas" w:hAnsi="Consolas"/>
+          <w:color w:val="1F2328"/>
+          <w:sz w:val="18"/>
+        </w:rPr>
+        <w:t>Semaphore(8)</w:t>
+      </w:r>
+      <w:r>
+        <w:t xml:space="preserve"> bounded</w:t>
+      </w:r>
+    </w:p>
+    <w:p>
+      <w:r>
+        <w:t xml:space="preserve">how many requests *ran*, but </w:t>
+      </w:r>
+      <w:r>
+        <w:rPr>
+          <w:rFonts w:ascii="Consolas" w:hAnsi="Consolas"/>
+          <w:color w:val="1F2328"/>
+          <w:sz w:val="18"/>
+        </w:rPr>
+        <w:t>withPermit</w:t>
+      </w:r>
+      <w:r>
+        <w:t xml:space="preserve"> waited without limit, so a connection</w:t>
+      </w:r>
+    </w:p>
+    <w:p>
+      <w:r>
+        <w:t>accepted while all eight permits were busy held its socket open for as long as the</w:t>
+      </w:r>
+    </w:p>
+    <w:p>
+      <w:r>
+        <w:t xml:space="preserve">slow peers took — a flood turned the cap into an unbounded queue. </w:t>
+      </w:r>
+      <w:r>
+        <w:rPr>
+          <w:rFonts w:ascii="Consolas" w:hAnsi="Consolas"/>
+          <w:color w:val="1F2328"/>
+          <w:sz w:val="18"/>
+        </w:rPr>
+        <w:t>serveIfPermitted()</w:t>
+      </w:r>
+    </w:p>
+    <w:p>
+      <w:r>
+        <w:t xml:space="preserve">now waits at most 6 s and answers </w:t>
+      </w:r>
+      <w:r>
+        <w:rPr>
+          <w:rFonts w:ascii="Consolas" w:hAnsi="Consolas"/>
+          <w:color w:val="1F2328"/>
+          <w:sz w:val="18"/>
+        </w:rPr>
+        <w:t>503</w:t>
+      </w:r>
+      <w:r>
+        <w:t xml:space="preserve"> + </w:t>
+      </w:r>
+      <w:r>
+        <w:rPr>
+          <w:rFonts w:ascii="Consolas" w:hAnsi="Consolas"/>
+          <w:color w:val="1F2328"/>
+          <w:sz w:val="18"/>
+        </w:rPr>
+        <w:t>Retry-After</w:t>
+      </w:r>
+      <w:r>
+        <w:t xml:space="preserve">; </w:t>
+      </w:r>
+      <w:r>
+        <w:rPr>
+          <w:rFonts w:ascii="Consolas" w:hAnsi="Consolas"/>
+          <w:color w:val="1F2328"/>
+          <w:sz w:val="18"/>
+        </w:rPr>
+        <w:t>awaitPermit()</w:t>
+      </w:r>
+      <w:r>
+        <w:t xml:space="preserve"> polls</w:t>
+      </w:r>
+    </w:p>
+    <w:p>
+      <w:r>
+        <w:rPr>
+          <w:rFonts w:ascii="Consolas" w:hAnsi="Consolas"/>
+          <w:color w:val="1F2328"/>
+          <w:sz w:val="18"/>
+        </w:rPr>
+        <w:t>tryAcquire()</w:t>
+      </w:r>
+      <w:r>
+        <w:t xml:space="preserve"> so acquisition and release stay on one linear path.</w:t>
+      </w:r>
+    </w:p>
+    <w:p>
+      <w:pPr>
+        <w:pStyle w:val="ListNumber"/>
+      </w:pPr>
+      <w:r>
+        <w:rPr>
+          <w:b/>
+        </w:rPr>
+        <w:t>A CI step I added in the previous round was killing `xcodebuild` (WS3).</w:t>
+      </w:r>
+      <w:r>
+        <w:t xml:space="preserve"> On PR #3</w:t>
+      </w:r>
+    </w:p>
+    <w:p>
+      <w:r>
+        <w:t>the watchOS job failed on a branch that does not touch Swift. Cause:</w:t>
+      </w:r>
+    </w:p>
+    <w:p>
+      <w:r>
+        <w:rPr>
+          <w:rFonts w:ascii="Consolas" w:hAnsi="Consolas"/>
+          <w:color w:val="1F2328"/>
+          <w:sz w:val="18"/>
+        </w:rPr>
+        <w:t>xcodebuild -version | head -n 1</w:t>
+      </w:r>
+      <w:r>
+        <w:t xml:space="preserve"> — </w:t>
+      </w:r>
+      <w:r>
+        <w:rPr>
+          <w:rFonts w:ascii="Consolas" w:hAnsi="Consolas"/>
+          <w:color w:val="1F2328"/>
+          <w:sz w:val="18"/>
+        </w:rPr>
+        <w:t>head</w:t>
+      </w:r>
+      <w:r>
+        <w:t xml:space="preserve"> exits once it has its line, so xcodebuild's</w:t>
+      </w:r>
+    </w:p>
+    <w:p>
+      <w:r>
+        <w:t xml:space="preserve">next write hit </w:t>
+      </w:r>
+      <w:r>
+        <w:rPr>
+          <w:rFonts w:ascii="Consolas" w:hAnsi="Consolas"/>
+          <w:color w:val="1F2328"/>
+          <w:sz w:val="18"/>
+        </w:rPr>
+        <w:t>SIGPIPE</w:t>
+      </w:r>
+      <w:r>
+        <w:t xml:space="preserve"> and it died with an uncaught</w:t>
+      </w:r>
+    </w:p>
+    <w:p>
+      <w:r>
+        <w:rPr>
+          <w:rFonts w:ascii="Consolas" w:hAnsi="Consolas"/>
+          <w:color w:val="1F2328"/>
+          <w:sz w:val="18"/>
+        </w:rPr>
+        <w:t>NSFileHandleOperationException ... Broken pipe</w:t>
+      </w:r>
+      <w:r>
+        <w:t>. The pipeline's status then came from</w:t>
+      </w:r>
+    </w:p>
+    <w:p>
+      <w:r>
+        <w:rPr>
+          <w:rFonts w:ascii="Consolas" w:hAnsi="Consolas"/>
+          <w:color w:val="1F2328"/>
+          <w:sz w:val="18"/>
+        </w:rPr>
+        <w:t>head</w:t>
+      </w:r>
+      <w:r>
+        <w:t xml:space="preserve">, so the step *usually* passed. Replaced with </w:t>
+      </w:r>
+      <w:r>
+        <w:rPr>
+          <w:rFonts w:ascii="Consolas" w:hAnsi="Consolas"/>
+          <w:color w:val="1F2328"/>
+          <w:sz w:val="18"/>
+        </w:rPr>
+        <w:t>awk 'NR==1'</w:t>
+      </w:r>
+      <w:r>
+        <w:t>, which consumes all</w:t>
+      </w:r>
+    </w:p>
+    <w:p>
+      <w:r>
+        <w:t>input and never closes the pipe early. A flaky check is worse than none: it devalues</w:t>
+      </w:r>
+    </w:p>
+    <w:p>
+      <w:r>
+        <w:t>every green run.</w:t>
+      </w:r>
+    </w:p>
+    <w:p>
+      <w:pPr>
+        <w:pStyle w:val="ListNumber"/>
+      </w:pPr>
+      <w:r>
+        <w:rPr>
+          <w:b/>
+        </w:rPr>
+        <w:t>HealthKit query failures were invisible on the watch (WS4).</w:t>
+      </w:r>
+      <w:r>
+        <w:t xml:space="preserve"> A failed</w:t>
+      </w:r>
+    </w:p>
+    <w:p>
+      <w:r>
+        <w:rPr>
+          <w:rFonts w:ascii="Consolas" w:hAnsi="Consolas"/>
+          <w:color w:val="1F2328"/>
+          <w:sz w:val="18"/>
+        </w:rPr>
+        <w:t>HKSampleQuery</w:t>
+      </w:r>
+      <w:r>
+        <w:t xml:space="preserve"> was only </w:t>
+      </w:r>
+      <w:r>
+        <w:rPr>
+          <w:rFonts w:ascii="Consolas" w:hAnsi="Consolas"/>
+          <w:color w:val="1F2328"/>
+          <w:sz w:val="18"/>
+        </w:rPr>
+        <w:t>print</w:t>
+      </w:r>
+      <w:r>
+        <w:t>ed, so revoked permission and "no sample yet" looked</w:t>
+      </w:r>
+    </w:p>
+    <w:p>
+      <w:r>
+        <w:t>identical, and a payload was POSTed even when neither vital had produced a sample.</w:t>
+      </w:r>
+    </w:p>
+    <w:p>
+      <w:r>
+        <w:t>Failures are now reported separately from absence, an empty poll pushes nothing, and</w:t>
+      </w:r>
+    </w:p>
+    <w:p>
+      <w:r>
+        <w:t>the sentinels render as "none yet" instead of "0 BPM".</w:t>
+      </w:r>
+    </w:p>
+    <w:p>
+      <w:pPr>
+        <w:pStyle w:val="ListNumber"/>
+      </w:pPr>
+      <w:r>
+        <w:rPr>
+          <w:b/>
+        </w:rPr>
+        <w:t>The XcodeGen contract was asserted nowhere (WS4).</w:t>
+      </w:r>
+      <w:r>
+        <w:t xml:space="preserve"> </w:t>
+      </w:r>
+      <w:r>
+        <w:rPr>
+          <w:rFonts w:ascii="Consolas" w:hAnsi="Consolas"/>
+          <w:color w:val="1F2328"/>
+          <w:sz w:val="18"/>
+        </w:rPr>
+        <w:t>xcodebuild</w:t>
+      </w:r>
+      <w:r>
+        <w:t xml:space="preserve"> proves the project</w:t>
+      </w:r>
+    </w:p>
+    <w:p>
+      <w:r>
+        <w:t xml:space="preserve">*compiles*, not that the plist still declares </w:t>
+      </w:r>
+      <w:r>
+        <w:rPr>
+          <w:rFonts w:ascii="Consolas" w:hAnsi="Consolas"/>
+          <w:color w:val="1F2328"/>
+          <w:sz w:val="18"/>
+        </w:rPr>
+        <w:t>WKApplication</w:t>
+      </w:r>
+      <w:r>
+        <w:t>, the HealthKit usage</w:t>
+      </w:r>
+    </w:p>
+    <w:p>
+      <w:r>
+        <w:t xml:space="preserve">strings, </w:t>
+      </w:r>
+      <w:r>
+        <w:rPr>
+          <w:rFonts w:ascii="Consolas" w:hAnsi="Consolas"/>
+          <w:color w:val="1F2328"/>
+          <w:sz w:val="18"/>
+        </w:rPr>
+        <w:t>NSAllowsArbitraryLoads</w:t>
+      </w:r>
+      <w:r>
+        <w:t xml:space="preserve"> (the only transport is plain HTTP on </w:t>
+      </w:r>
+      <w:r>
+        <w:rPr>
+          <w:rFonts w:ascii="Consolas" w:hAnsi="Consolas"/>
+          <w:color w:val="1F2328"/>
+          <w:sz w:val="18"/>
+        </w:rPr>
+        <w:t>:8484</w:t>
+      </w:r>
+      <w:r>
+        <w:t>) and</w:t>
+      </w:r>
+    </w:p>
+    <w:p>
+      <w:r>
+        <w:rPr>
+          <w:rFonts w:ascii="Consolas" w:hAnsi="Consolas"/>
+          <w:color w:val="1F2328"/>
+          <w:sz w:val="18"/>
+        </w:rPr>
+        <w:t>workout-processing</w:t>
+      </w:r>
+      <w:r>
+        <w:t xml:space="preserve">. Those are now checked against the </w:t>
+      </w:r>
+      <w:r>
+        <w:rPr>
+          <w:b/>
+        </w:rPr>
+        <w:t>generated</w:t>
+      </w:r>
+      <w:r>
+        <w:t xml:space="preserve"> project in CI,</w:t>
+      </w:r>
+    </w:p>
+    <w:p>
+      <w:r>
+        <w:t xml:space="preserve">along with </w:t>
+      </w:r>
+      <w:r>
+        <w:rPr>
+          <w:rFonts w:ascii="Consolas" w:hAnsi="Consolas"/>
+          <w:color w:val="1F2328"/>
+          <w:sz w:val="18"/>
+        </w:rPr>
+        <w:t>SDKROOT=watchos</w:t>
+      </w:r>
+      <w:r>
+        <w:t xml:space="preserve">, deployment target </w:t>
+      </w:r>
+      <w:r>
+        <w:rPr>
+          <w:rFonts w:ascii="Consolas" w:hAnsi="Consolas"/>
+          <w:color w:val="1F2328"/>
+          <w:sz w:val="18"/>
+        </w:rPr>
+        <w:t>10.0</w:t>
+      </w:r>
+      <w:r>
+        <w:t>, the bundle id, and a scheme</w:t>
+      </w:r>
+    </w:p>
+    <w:p>
+      <w:r>
+        <w:t>read-back. Verified output:</w:t>
+      </w:r>
+    </w:p>
+    <w:p>
+      <w:pPr>
+        <w:spacing w:after="200"/>
+        <w:ind w:left="280"/>
+      </w:pPr>
+      <w:r>
+        <w:rPr>
+          <w:rFonts w:ascii="Consolas" w:hAnsi="Consolas"/>
+          <w:color w:val="1F2328"/>
+          <w:sz w:val="17"/>
+        </w:rPr>
+        <w:t xml:space="preserve">   present: WKApplication</w:t>
+        <w:br/>
+        <w:t xml:space="preserve">   present: WKWatchOnly</w:t>
+        <w:br/>
+        <w:t xml:space="preserve">   present: NSHealthShareUsageDescription</w:t>
+        <w:br/>
+        <w:t xml:space="preserve">   present: NSHealthUpdateUsageDescription</w:t>
+        <w:br/>
+        <w:t xml:space="preserve">   NSAppTransportSecurity.NSAllowsArbitraryLoads = true</w:t>
+        <w:br/>
+        <w:t xml:space="preserve">   UIBackgroundModes includes workout-processing</w:t>
+        <w:br/>
+        <w:t xml:space="preserve">   SDKROOT = watchos</w:t>
+        <w:br/>
+        <w:t xml:space="preserve">   WATCHOS_DEPLOYMENT_TARGET = 10.0</w:t>
+        <w:br/>
+        <w:t xml:space="preserve">   PRODUCT_BUNDLE_IDENTIFIER = com.bridge.applewatch.watchkitapp</w:t>
+      </w:r>
+    </w:p>
+    <w:p>
+      <w:pPr>
+        <w:pStyle w:val="Heading2"/>
+      </w:pPr>
+      <w:r>
+        <w:t>13.3 A test that was wrong, and the contract it clarified</w:t>
+      </w:r>
+    </w:p>
+    <w:p>
+      <w:r>
+        <w:t xml:space="preserve">While adding SpO2 boundary tests I asserted that the native </w:t>
+      </w:r>
+      <w:r>
+        <w:rPr>
+          <w:rFonts w:ascii="Consolas" w:hAnsi="Consolas"/>
+          <w:color w:val="1F2328"/>
+          <w:sz w:val="18"/>
+        </w:rPr>
+        <w:t>spo2</w:t>
+      </w:r>
+      <w:r>
+        <w:t xml:space="preserve"> key scales a </w:t>
+      </w:r>
+      <w:r>
+        <w:rPr>
+          <w:rFonts w:ascii="Consolas" w:hAnsi="Consolas"/>
+          <w:color w:val="1F2328"/>
+          <w:sz w:val="18"/>
+        </w:rPr>
+        <w:t>0.5</w:t>
+      </w:r>
+    </w:p>
+    <w:p>
+      <w:r>
+        <w:t xml:space="preserve">fraction to </w:t>
+      </w:r>
+      <w:r>
+        <w:rPr>
+          <w:rFonts w:ascii="Consolas" w:hAnsi="Consolas"/>
+          <w:color w:val="1F2328"/>
+          <w:sz w:val="18"/>
+        </w:rPr>
+        <w:t>50.0 %</w:t>
+      </w:r>
+      <w:r>
+        <w:t xml:space="preserve">. </w:t>
+      </w:r>
+      <w:r>
+        <w:rPr>
+          <w:b/>
+        </w:rPr>
+        <w:t>The test failed, and the test was wrong, not the parser.</w:t>
+      </w:r>
+      <w:r>
+        <w:t xml:space="preserve"> The</w:t>
+      </w:r>
+    </w:p>
+    <w:p>
+      <w:r>
+        <w:t xml:space="preserve">implementation treats the native </w:t>
+      </w:r>
+      <w:r>
+        <w:rPr>
+          <w:rFonts w:ascii="Consolas" w:hAnsi="Consolas"/>
+          <w:color w:val="1F2328"/>
+          <w:sz w:val="18"/>
+        </w:rPr>
+        <w:t>spo2</w:t>
+      </w:r>
+      <w:r>
+        <w:t xml:space="preserve"> key as *always a percentage* and scales only the</w:t>
+      </w:r>
+    </w:p>
+    <w:p>
+      <w:r>
+        <w:t>HealthKit-named keys (</w:t>
+      </w:r>
+      <w:r>
+        <w:rPr>
+          <w:rFonts w:ascii="Consolas" w:hAnsi="Consolas"/>
+          <w:color w:val="1F2328"/>
+          <w:sz w:val="18"/>
+        </w:rPr>
+        <w:t>blood_oxygen_saturation</w:t>
+      </w:r>
+      <w:r>
+        <w:t xml:space="preserve">, </w:t>
+      </w:r>
+      <w:r>
+        <w:rPr>
+          <w:rFonts w:ascii="Consolas" w:hAnsi="Consolas"/>
+          <w:color w:val="1F2328"/>
+          <w:sz w:val="18"/>
+        </w:rPr>
+        <w:t>oxygen_saturation</w:t>
+      </w:r>
+      <w:r>
+        <w:t>) and the Health Auto</w:t>
+      </w:r>
+    </w:p>
+    <w:p>
+      <w:r>
+        <w:t xml:space="preserve">Export metric. That is a deliberate and necessary distinction: a value of exactly </w:t>
+      </w:r>
+      <w:r>
+        <w:rPr>
+          <w:rFonts w:ascii="Consolas" w:hAnsi="Consolas"/>
+          <w:color w:val="1F2328"/>
+          <w:sz w:val="18"/>
+        </w:rPr>
+        <w:t>1.0</w:t>
+      </w:r>
+      <w:r>
+        <w:t xml:space="preserve"> is</w:t>
+      </w:r>
+    </w:p>
+    <w:p>
+      <w:r>
+        <w:t>otherwise ambiguous between 1 % and 100 %. The tests now pin both halves of that contract</w:t>
+      </w:r>
+    </w:p>
+    <w:p>
+      <w:r>
+        <w:t>explicitly (</w:t>
+      </w:r>
+      <w:r>
+        <w:rPr>
+          <w:rFonts w:ascii="Consolas" w:hAnsi="Consolas"/>
+          <w:color w:val="1F2328"/>
+          <w:sz w:val="18"/>
+        </w:rPr>
+        <w:t>the native spo2 key is a percentage and is never rescaled</w:t>
+      </w:r>
+      <w:r>
+        <w:t xml:space="preserve"> and `only the</w:t>
+      </w:r>
+    </w:p>
+    <w:p>
+      <w:r>
+        <w:t>HealthKit-named spo2 keys are treated as fractions`), which is more valuable than the</w:t>
+      </w:r>
+    </w:p>
+    <w:p>
+      <w:r>
+        <w:t>assertion I originally intended.</w:t>
+      </w:r>
+    </w:p>
+    <w:p>
+      <w:pPr>
+        <w:pStyle w:val="Heading2"/>
+      </w:pPr>
+      <w:r>
+        <w:t>13.4 Verification for `v1.2.0`</w:t>
+      </w:r>
+    </w:p>
+    <w:tbl>
+      <w:tblPr>
+        <w:tblStyle w:val="TableGrid"/>
+        <w:tblW w:type="auto" w:w="0"/>
+        <w:tblLook w:firstColumn="1" w:firstRow="1" w:lastColumn="0" w:lastRow="0" w:noHBand="0" w:noVBand="1" w:val="04A0"/>
+      </w:tblPr>
+      <w:tblGrid>
+        <w:gridCol w:w="4320"/>
+        <w:gridCol w:w="4320"/>
+      </w:tblGrid>
+      <w:tr>
+        <w:tc>
+          <w:tcPr>
+            <w:tcW w:type="dxa" w:w="4320"/>
+          </w:tcPr>
+          <w:p>
+            <w:r>
+              <w:rPr>
+                <w:b/>
+                <w:sz w:val="18"/>
+              </w:rPr>
+            </w:r>
+            <w:r>
+              <w:rPr>
+                <w:b/>
+                <w:sz w:val="18"/>
+              </w:rPr>
+              <w:t>Gate</w:t>
+            </w:r>
+          </w:p>
+        </w:tc>
+        <w:tc>
+          <w:tcPr>
+            <w:tcW w:type="dxa" w:w="4320"/>
+          </w:tcPr>
+          <w:p>
+            <w:r>
+              <w:rPr>
+                <w:b/>
+                <w:sz w:val="18"/>
+              </w:rPr>
+            </w:r>
+            <w:r>
+              <w:rPr>
+                <w:b/>
+                <w:sz w:val="18"/>
+              </w:rPr>
+              <w:t>Result</w:t>
+            </w:r>
+          </w:p>
+        </w:tc>
+      </w:tr>
+      <w:tr>
+        <w:tc>
+          <w:tcPr>
+            <w:tcW w:type="dxa" w:w="4320"/>
+          </w:tcPr>
+          <w:p>
+            <w:r>
+              <w:rPr>
+                <w:sz w:val="18"/>
+              </w:rPr>
+            </w:r>
+            <w:r>
+              <w:rPr>
+                <w:sz w:val="18"/>
+              </w:rPr>
+              <w:t>Unit tests</w:t>
+            </w:r>
+          </w:p>
+        </w:tc>
+        <w:tc>
+          <w:tcPr>
+            <w:tcW w:type="dxa" w:w="4320"/>
+          </w:tcPr>
+          <w:p>
+            <w:r>
+              <w:rPr>
+                <w:sz w:val="18"/>
+              </w:rPr>
+            </w:r>
+            <w:r>
+              <w:rPr>
+                <w:b/>
+                <w:sz w:val="18"/>
+              </w:rPr>
+              <w:t>84</w:t>
+            </w:r>
+            <w:r>
+              <w:rPr>
+                <w:sz w:val="18"/>
+              </w:rPr>
+              <w:t xml:space="preserve"> (was 58): BridgePolicy 18, WebhookPayloadParser 24, WatchBridgeService 14, HealthConnectManager 9 (new), AppleHealthXmlImporter 8, BlePacketParser 11</w:t>
+            </w:r>
+          </w:p>
+        </w:tc>
+      </w:tr>
+      <w:tr>
+        <w:tc>
+          <w:tcPr>
+            <w:tcW w:type="dxa" w:w="4320"/>
+          </w:tcPr>
+          <w:p>
+            <w:r>
+              <w:rPr>
+                <w:sz w:val="18"/>
+              </w:rPr>
+            </w:r>
+            <w:r>
+              <w:rPr>
+                <w:sz w:val="18"/>
+              </w:rPr>
+              <w:t>Android Lint</w:t>
+            </w:r>
+          </w:p>
+        </w:tc>
+        <w:tc>
+          <w:tcPr>
+            <w:tcW w:type="dxa" w:w="4320"/>
+          </w:tcPr>
+          <w:p>
+            <w:r>
+              <w:rPr>
+                <w:sz w:val="18"/>
+              </w:rPr>
+            </w:r>
+            <w:r>
+              <w:rPr>
+                <w:sz w:val="18"/>
+              </w:rPr>
+              <w:t>0 errors / 14 warnings (baseline)</w:t>
+            </w:r>
+          </w:p>
+        </w:tc>
+      </w:tr>
+      <w:tr>
+        <w:tc>
+          <w:tcPr>
+            <w:tcW w:type="dxa" w:w="4320"/>
+          </w:tcPr>
+          <w:p>
+            <w:r>
+              <w:rPr>
+                <w:sz w:val="18"/>
+              </w:rPr>
+            </w:r>
+            <w:r>
+              <w:rPr>
+                <w:rFonts w:ascii="Consolas" w:hAnsi="Consolas"/>
+                <w:color w:val="1F2328"/>
+                <w:sz w:val="18"/>
+              </w:rPr>
+              <w:t>assembleDebug</w:t>
+            </w:r>
+            <w:r>
+              <w:rPr>
+                <w:sz w:val="18"/>
+              </w:rPr>
+              <w:t xml:space="preserve"> / </w:t>
+            </w:r>
+            <w:r>
+              <w:rPr>
+                <w:rFonts w:ascii="Consolas" w:hAnsi="Consolas"/>
+                <w:color w:val="1F2328"/>
+                <w:sz w:val="18"/>
+              </w:rPr>
+              <w:t>assembleRelease</w:t>
+            </w:r>
+          </w:p>
+        </w:tc>
+        <w:tc>
+          <w:tcPr>
+            <w:tcW w:type="dxa" w:w="4320"/>
+          </w:tcPr>
+          <w:p>
+            <w:r>
+              <w:rPr>
+                <w:sz w:val="18"/>
+              </w:rPr>
+            </w:r>
+            <w:r>
+              <w:rPr>
+                <w:sz w:val="18"/>
+              </w:rPr>
+              <w:t>pass</w:t>
+            </w:r>
+          </w:p>
+        </w:tc>
+      </w:tr>
+      <w:tr>
+        <w:tc>
+          <w:tcPr>
+            <w:tcW w:type="dxa" w:w="4320"/>
+          </w:tcPr>
+          <w:p>
+            <w:r>
+              <w:rPr>
+                <w:sz w:val="18"/>
+              </w:rPr>
+            </w:r>
+            <w:r>
+              <w:rPr>
+                <w:rFonts w:ascii="Consolas" w:hAnsi="Consolas"/>
+                <w:color w:val="1F2328"/>
+                <w:sz w:val="18"/>
+              </w:rPr>
+              <w:t>versionName</w:t>
+            </w:r>
+            <w:r>
+              <w:rPr>
+                <w:sz w:val="18"/>
+              </w:rPr>
+              <w:t xml:space="preserve"> in the built APK</w:t>
+            </w:r>
+          </w:p>
+        </w:tc>
+        <w:tc>
+          <w:tcPr>
+            <w:tcW w:type="dxa" w:w="4320"/>
+          </w:tcPr>
+          <w:p>
+            <w:r>
+              <w:rPr>
+                <w:sz w:val="18"/>
+              </w:rPr>
+            </w:r>
+            <w:r>
+              <w:rPr>
+                <w:rFonts w:ascii="Consolas" w:hAnsi="Consolas"/>
+                <w:color w:val="1F2328"/>
+                <w:sz w:val="18"/>
+              </w:rPr>
+              <w:t>1.2.0</w:t>
+            </w:r>
+            <w:r>
+              <w:rPr>
+                <w:sz w:val="18"/>
+              </w:rPr>
+              <w:t xml:space="preserve">, </w:t>
+            </w:r>
+            <w:r>
+              <w:rPr>
+                <w:rFonts w:ascii="Consolas" w:hAnsi="Consolas"/>
+                <w:color w:val="1F2328"/>
+                <w:sz w:val="18"/>
+              </w:rPr>
+              <w:t>versionCode</w:t>
+            </w:r>
+            <w:r>
+              <w:rPr>
+                <w:sz w:val="18"/>
+              </w:rPr>
+              <w:t xml:space="preserve"> 5 (read back with </w:t>
+            </w:r>
+            <w:r>
+              <w:rPr>
+                <w:rFonts w:ascii="Consolas" w:hAnsi="Consolas"/>
+                <w:color w:val="1F2328"/>
+                <w:sz w:val="18"/>
+              </w:rPr>
+              <w:t>aapt2 dump badging</w:t>
+            </w:r>
+            <w:r>
+              <w:rPr>
+                <w:sz w:val="18"/>
+              </w:rPr>
+              <w:t>)</w:t>
+            </w:r>
+          </w:p>
+        </w:tc>
+      </w:tr>
+      <w:tr>
+        <w:tc>
+          <w:tcPr>
+            <w:tcW w:type="dxa" w:w="4320"/>
+          </w:tcPr>
+          <w:p>
+            <w:r>
+              <w:rPr>
+                <w:sz w:val="18"/>
+              </w:rPr>
+            </w:r>
+            <w:r>
+              <w:rPr>
+                <w:sz w:val="18"/>
+              </w:rPr>
+              <w:t>CI</w:t>
+            </w:r>
+          </w:p>
+        </w:tc>
+        <w:tc>
+          <w:tcPr>
+            <w:tcW w:type="dxa" w:w="4320"/>
+          </w:tcPr>
+          <w:p>
+            <w:r>
+              <w:rPr>
+                <w:sz w:val="18"/>
+              </w:rPr>
+            </w:r>
+            <w:r>
+              <w:rPr>
+                <w:sz w:val="18"/>
+              </w:rPr>
+              <w:t>four PRs, each with both jobs green before merge</w:t>
+            </w:r>
+          </w:p>
+        </w:tc>
+      </w:tr>
+      <w:tr>
+        <w:tc>
+          <w:tcPr>
+            <w:tcW w:type="dxa" w:w="4320"/>
+          </w:tcPr>
+          <w:p>
+            <w:r>
+              <w:rPr>
+                <w:sz w:val="18"/>
+              </w:rPr>
+            </w:r>
+            <w:r>
+              <w:rPr>
+                <w:sz w:val="18"/>
+              </w:rPr>
+              <w:t>watchOS contract checks</w:t>
+            </w:r>
+          </w:p>
+        </w:tc>
+        <w:tc>
+          <w:tcPr>
+            <w:tcW w:type="dxa" w:w="4320"/>
+          </w:tcPr>
+          <w:p>
+            <w:r>
+              <w:rPr>
+                <w:sz w:val="18"/>
+              </w:rPr>
+            </w:r>
+            <w:r>
+              <w:rPr>
+                <w:sz w:val="18"/>
+              </w:rPr>
+              <w:t>all nine assertions pass against the generated project</w:t>
+            </w:r>
+          </w:p>
+        </w:tc>
+      </w:tr>
+    </w:tbl>
+    <w:p/>
+    <w:p>
+      <w:pPr>
+        <w:pStyle w:val="Heading2"/>
+      </w:pPr>
+      <w:r>
+        <w:t>13.5 Limits, restated</w:t>
+      </w:r>
+    </w:p>
+    <w:p>
+      <w:r>
+        <w:t>Unchanged from §12.5 and worth repeating because none of it was addressed by this work:</w:t>
+      </w:r>
+    </w:p>
+    <w:p>
+      <w:r>
+        <w:rPr>
+          <w:b/>
+        </w:rPr>
+        <w:t>no physical device</w:t>
+      </w:r>
+      <w:r>
+        <w:t>, no rendered UI, and no signed or installed watch app. The 84 tests</w:t>
+      </w:r>
+    </w:p>
+    <w:p>
+      <w:r>
+        <w:t>are still JVM/Robolectric tests. Everything about real radios, real Health Connect, and a</w:t>
+      </w:r>
+    </w:p>
+    <w:p>
+      <w:r>
+        <w:t>real Apple Watch posting over a real hotspot remains unverified.</w:t>
       </w:r>
     </w:p>
     <w:sectPr>

</xml_diff>

<commit_message>
docs(report): add the v1.2.0 release metrics row
44 tracked files / 1,056,310 bytes / 84 tests, reproduced with scripts/verify_repo_metrics.py.
</commit_message>
<xml_diff>
--- a/docs/AW9_PIXEL_BRIDGE_ENGAGEMENT_REPORT.docx
+++ b/docs/AW9_PIXEL_BRIDGE_ENGAGEMENT_REPORT.docx
@@ -1417,6 +1417,116 @@
                 <w:sz w:val="18"/>
               </w:rPr>
               <w:t>58</w:t>
+            </w:r>
+          </w:p>
+        </w:tc>
+        <w:tc>
+          <w:tcPr>
+            <w:tcW w:type="dxa" w:w="1440"/>
+          </w:tcPr>
+          <w:p>
+            <w:r>
+              <w:rPr>
+                <w:sz w:val="18"/>
+              </w:rPr>
+            </w:r>
+            <w:r>
+              <w:rPr>
+                <w:sz w:val="18"/>
+              </w:rPr>
+              <w:t>0 errors / 14 warnings</w:t>
+            </w:r>
+          </w:p>
+        </w:tc>
+      </w:tr>
+      <w:tr>
+        <w:tc>
+          <w:tcPr>
+            <w:tcW w:type="dxa" w:w="1440"/>
+          </w:tcPr>
+          <w:p>
+            <w:r>
+              <w:rPr>
+                <w:sz w:val="18"/>
+              </w:rPr>
+            </w:r>
+            <w:r>
+              <w:rPr>
+                <w:sz w:val="18"/>
+              </w:rPr>
+              <w:t>v1.2.0</w:t>
+            </w:r>
+          </w:p>
+        </w:tc>
+        <w:tc>
+          <w:tcPr>
+            <w:tcW w:type="dxa" w:w="1440"/>
+          </w:tcPr>
+          <w:p>
+            <w:r>
+              <w:rPr>
+                <w:sz w:val="18"/>
+              </w:rPr>
+            </w:r>
+            <w:r>
+              <w:rPr>
+                <w:sz w:val="18"/>
+              </w:rPr>
+              <w:t>Four hardening PRs, PRs opened and CI-verified before merge</w:t>
+            </w:r>
+          </w:p>
+        </w:tc>
+        <w:tc>
+          <w:tcPr>
+            <w:tcW w:type="dxa" w:w="1440"/>
+          </w:tcPr>
+          <w:p>
+            <w:r>
+              <w:rPr>
+                <w:sz w:val="18"/>
+              </w:rPr>
+            </w:r>
+            <w:r>
+              <w:rPr>
+                <w:sz w:val="18"/>
+              </w:rPr>
+              <w:t>44</w:t>
+            </w:r>
+          </w:p>
+        </w:tc>
+        <w:tc>
+          <w:tcPr>
+            <w:tcW w:type="dxa" w:w="1440"/>
+          </w:tcPr>
+          <w:p>
+            <w:r>
+              <w:rPr>
+                <w:sz w:val="18"/>
+              </w:rPr>
+            </w:r>
+            <w:r>
+              <w:rPr>
+                <w:sz w:val="18"/>
+              </w:rPr>
+              <w:t>1,056,310</w:t>
+            </w:r>
+          </w:p>
+        </w:tc>
+        <w:tc>
+          <w:tcPr>
+            <w:tcW w:type="dxa" w:w="1440"/>
+          </w:tcPr>
+          <w:p>
+            <w:r>
+              <w:rPr>
+                <w:sz w:val="18"/>
+              </w:rPr>
+            </w:r>
+            <w:r>
+              <w:rPr>
+                <w:sz w:val="18"/>
+              </w:rPr>
+              <w:t>84</w:t>
             </w:r>
           </w:p>
         </w:tc>

</xml_diff>

<commit_message>
docs(report): record the v1.2.1 audit round in section 14
Documents the method (three independent adversarial read-only audits, with their
convergence on the same two defects as the reason those were trusted), the two silent
defects that had shipped for three releases, the data-loss and mislabelled-data
clusters, the platform-ceiling defect the earlier audits did not reach, and the test
honesty finding: the manager's ten sentinel gates had zero coverage, so deleting all of
them kept the suite green.

Also records the two deliberate non-fixes (debug-signed releases, the duplicate packet
that was never committed) and restates that the APK has still never run on a device.
The Word companion is regenerated from the Markdown.
</commit_message>
<xml_diff>
--- a/docs/AW9_PIXEL_BRIDGE_ENGAGEMENT_REPORT.docx
+++ b/docs/AW9_PIXEL_BRIDGE_ENGAGEMENT_REPORT.docx
@@ -1545,6 +1545,116 @@
                 <w:sz w:val="18"/>
               </w:rPr>
               <w:t>0 errors / 14 warnings</w:t>
+            </w:r>
+          </w:p>
+        </w:tc>
+      </w:tr>
+      <w:tr>
+        <w:tc>
+          <w:tcPr>
+            <w:tcW w:type="dxa" w:w="1440"/>
+          </w:tcPr>
+          <w:p>
+            <w:r>
+              <w:rPr>
+                <w:sz w:val="18"/>
+              </w:rPr>
+            </w:r>
+            <w:r>
+              <w:rPr>
+                <w:sz w:val="18"/>
+              </w:rPr>
+              <w:t>v1.2.1</w:t>
+            </w:r>
+          </w:p>
+        </w:tc>
+        <w:tc>
+          <w:tcPr>
+            <w:tcW w:type="dxa" w:w="1440"/>
+          </w:tcPr>
+          <w:p>
+            <w:r>
+              <w:rPr>
+                <w:sz w:val="18"/>
+              </w:rPr>
+            </w:r>
+            <w:r>
+              <w:rPr>
+                <w:sz w:val="18"/>
+              </w:rPr>
+              <w:t>Audit remediation: 45 findings from three independent audits</w:t>
+            </w:r>
+          </w:p>
+        </w:tc>
+        <w:tc>
+          <w:tcPr>
+            <w:tcW w:type="dxa" w:w="1440"/>
+          </w:tcPr>
+          <w:p>
+            <w:r>
+              <w:rPr>
+                <w:sz w:val="18"/>
+              </w:rPr>
+            </w:r>
+            <w:r>
+              <w:rPr>
+                <w:sz w:val="18"/>
+              </w:rPr>
+              <w:t>48</w:t>
+            </w:r>
+          </w:p>
+        </w:tc>
+        <w:tc>
+          <w:tcPr>
+            <w:tcW w:type="dxa" w:w="1440"/>
+          </w:tcPr>
+          <w:p>
+            <w:r>
+              <w:rPr>
+                <w:sz w:val="18"/>
+              </w:rPr>
+            </w:r>
+            <w:r>
+              <w:rPr>
+                <w:sz w:val="18"/>
+              </w:rPr>
+              <w:t>1,149,337</w:t>
+            </w:r>
+          </w:p>
+        </w:tc>
+        <w:tc>
+          <w:tcPr>
+            <w:tcW w:type="dxa" w:w="1440"/>
+          </w:tcPr>
+          <w:p>
+            <w:r>
+              <w:rPr>
+                <w:sz w:val="18"/>
+              </w:rPr>
+            </w:r>
+            <w:r>
+              <w:rPr>
+                <w:sz w:val="18"/>
+              </w:rPr>
+              <w:t>113</w:t>
+            </w:r>
+          </w:p>
+        </w:tc>
+        <w:tc>
+          <w:tcPr>
+            <w:tcW w:type="dxa" w:w="1440"/>
+          </w:tcPr>
+          <w:p>
+            <w:r>
+              <w:rPr>
+                <w:sz w:val="18"/>
+              </w:rPr>
+            </w:r>
+            <w:r>
+              <w:rPr>
+                <w:sz w:val="18"/>
+              </w:rPr>
+              <w:t>0 errors / 13 warnings</w:t>
             </w:r>
           </w:p>
         </w:tc>
@@ -15369,6 +15479,1786 @@
     <w:p>
       <w:r>
         <w:t>real Apple Watch posting over a real hotspot remains unverified.</w:t>
+      </w:r>
+    </w:p>
+    <w:p>
+      <w:pPr>
+        <w:jc w:val="center"/>
+      </w:pPr>
+      <w:r>
+        <w:rPr>
+          <w:color w:val="888888"/>
+          <w:sz w:val="18"/>
+        </w:rPr>
+        <w:t>• • •</w:t>
+      </w:r>
+    </w:p>
+    <w:p>
+      <w:pPr>
+        <w:pStyle w:val="Heading1"/>
+      </w:pPr>
+      <w:r>
+        <w:t>14. `v1.2.1` — the audit round</w:t>
+      </w:r>
+    </w:p>
+    <w:p>
+      <w:pPr>
+        <w:pStyle w:val="Heading2"/>
+      </w:pPr>
+      <w:r>
+        <w:t>14.1 Method</w:t>
+      </w:r>
+    </w:p>
+    <w:p>
+      <w:r>
+        <w:t>Previous rounds relied on my own reading plus CI. For this round I deliberately did not:</w:t>
+      </w:r>
+    </w:p>
+    <w:p>
+      <w:r>
+        <w:rPr>
+          <w:b/>
+        </w:rPr>
+        <w:t>three independent adversarial read-only audits</w:t>
+      </w:r>
+      <w:r>
+        <w:t xml:space="preserve"> were commissioned, each with a</w:t>
+      </w:r>
+    </w:p>
+    <w:p>
+      <w:r>
+        <w:t>disjoint scope and an explicit instruction to build a concrete trigger for every finding</w:t>
+      </w:r>
+    </w:p>
+    <w:p>
+      <w:r>
+        <w:t>or drop it.</w:t>
+      </w:r>
+    </w:p>
+    <w:tbl>
+      <w:tblPr>
+        <w:tblStyle w:val="TableGrid"/>
+        <w:tblW w:type="auto" w:w="0"/>
+        <w:tblLook w:firstColumn="1" w:firstRow="1" w:lastColumn="0" w:lastRow="0" w:noHBand="0" w:noVBand="1" w:val="04A0"/>
+      </w:tblPr>
+      <w:tblGrid>
+        <w:gridCol w:w="4320"/>
+        <w:gridCol w:w="4320"/>
+      </w:tblGrid>
+      <w:tr>
+        <w:tc>
+          <w:tcPr>
+            <w:tcW w:type="dxa" w:w="4320"/>
+          </w:tcPr>
+          <w:p>
+            <w:r>
+              <w:rPr>
+                <w:b/>
+                <w:sz w:val="18"/>
+              </w:rPr>
+            </w:r>
+            <w:r>
+              <w:rPr>
+                <w:b/>
+                <w:sz w:val="18"/>
+              </w:rPr>
+              <w:t>Auditor</w:t>
+            </w:r>
+          </w:p>
+        </w:tc>
+        <w:tc>
+          <w:tcPr>
+            <w:tcW w:type="dxa" w:w="4320"/>
+          </w:tcPr>
+          <w:p>
+            <w:r>
+              <w:rPr>
+                <w:b/>
+                <w:sz w:val="18"/>
+              </w:rPr>
+            </w:r>
+            <w:r>
+              <w:rPr>
+                <w:b/>
+                <w:sz w:val="18"/>
+              </w:rPr>
+              <w:t>Scope</w:t>
+            </w:r>
+          </w:p>
+        </w:tc>
+      </w:tr>
+      <w:tr>
+        <w:tc>
+          <w:tcPr>
+            <w:tcW w:type="dxa" w:w="4320"/>
+          </w:tcPr>
+          <w:p>
+            <w:r>
+              <w:rPr>
+                <w:sz w:val="18"/>
+              </w:rPr>
+            </w:r>
+            <w:r>
+              <w:rPr>
+                <w:sz w:val="18"/>
+              </w:rPr>
+              <w:t>A</w:t>
+            </w:r>
+          </w:p>
+        </w:tc>
+        <w:tc>
+          <w:tcPr>
+            <w:tcW w:type="dxa" w:w="4320"/>
+          </w:tcPr>
+          <w:p>
+            <w:r>
+              <w:rPr>
+                <w:sz w:val="18"/>
+              </w:rPr>
+            </w:r>
+            <w:r>
+              <w:rPr>
+                <w:sz w:val="18"/>
+              </w:rPr>
+              <w:t>Android runtime: service, policy, activity, BLE parser, control dispatcher, manifest</w:t>
+            </w:r>
+          </w:p>
+        </w:tc>
+      </w:tr>
+      <w:tr>
+        <w:tc>
+          <w:tcPr>
+            <w:tcW w:type="dxa" w:w="4320"/>
+          </w:tcPr>
+          <w:p>
+            <w:r>
+              <w:rPr>
+                <w:sz w:val="18"/>
+              </w:rPr>
+            </w:r>
+            <w:r>
+              <w:rPr>
+                <w:sz w:val="18"/>
+              </w:rPr>
+              <w:t>B</w:t>
+            </w:r>
+          </w:p>
+        </w:tc>
+        <w:tc>
+          <w:tcPr>
+            <w:tcW w:type="dxa" w:w="4320"/>
+          </w:tcPr>
+          <w:p>
+            <w:r>
+              <w:rPr>
+                <w:sz w:val="18"/>
+              </w:rPr>
+            </w:r>
+            <w:r>
+              <w:rPr>
+                <w:sz w:val="18"/>
+              </w:rPr>
+              <w:t xml:space="preserve">Health-data layer: </w:t>
+            </w:r>
+            <w:r>
+              <w:rPr>
+                <w:rFonts w:ascii="Consolas" w:hAnsi="Consolas"/>
+                <w:color w:val="1F2328"/>
+                <w:sz w:val="18"/>
+              </w:rPr>
+              <w:t>HealthConnectManager</w:t>
+            </w:r>
+            <w:r>
+              <w:rPr>
+                <w:sz w:val="18"/>
+              </w:rPr>
+              <w:t>, XML importer, webhook parser, build config</w:t>
+            </w:r>
+          </w:p>
+        </w:tc>
+      </w:tr>
+      <w:tr>
+        <w:tc>
+          <w:tcPr>
+            <w:tcW w:type="dxa" w:w="4320"/>
+          </w:tcPr>
+          <w:p>
+            <w:r>
+              <w:rPr>
+                <w:sz w:val="18"/>
+              </w:rPr>
+            </w:r>
+            <w:r>
+              <w:rPr>
+                <w:sz w:val="18"/>
+              </w:rPr>
+              <w:t>C</w:t>
+            </w:r>
+          </w:p>
+        </w:tc>
+        <w:tc>
+          <w:tcPr>
+            <w:tcW w:type="dxa" w:w="4320"/>
+          </w:tcPr>
+          <w:p>
+            <w:r>
+              <w:rPr>
+                <w:sz w:val="18"/>
+              </w:rPr>
+            </w:r>
+            <w:r>
+              <w:rPr>
+                <w:sz w:val="18"/>
+              </w:rPr>
+              <w:t xml:space="preserve">watchOS: Swift, XcodeGen spec, </w:t>
+            </w:r>
+            <w:r>
+              <w:rPr>
+                <w:rFonts w:ascii="Consolas" w:hAnsi="Consolas"/>
+                <w:color w:val="1F2328"/>
+                <w:sz w:val="18"/>
+              </w:rPr>
+              <w:t>Info.plist</w:t>
+            </w:r>
+            <w:r>
+              <w:rPr>
+                <w:sz w:val="18"/>
+              </w:rPr>
+              <w:t>, CI workflow</w:t>
+            </w:r>
+          </w:p>
+        </w:tc>
+      </w:tr>
+    </w:tbl>
+    <w:p/>
+    <w:p>
+      <w:r>
+        <w:t xml:space="preserve">They produced </w:t>
+      </w:r>
+      <w:r>
+        <w:rPr>
+          <w:b/>
+        </w:rPr>
+        <w:t>45 findings</w:t>
+      </w:r>
+      <w:r>
+        <w:t xml:space="preserve">. Crucially, they </w:t>
+      </w:r>
+      <w:r>
+        <w:rPr>
+          <w:b/>
+        </w:rPr>
+        <w:t>converged independently</w:t>
+      </w:r>
+      <w:r>
+        <w:t>: the step</w:t>
+      </w:r>
+    </w:p>
+    <w:p>
+      <w:r>
+        <w:t>record-id collision was found by A and B separately; the SDNN/RMSSD mislabelling by A, B</w:t>
+      </w:r>
+    </w:p>
+    <w:p>
+      <w:r>
+        <w:t>and C. Independent agreement on the same defect is much stronger evidence than a single</w:t>
+      </w:r>
+    </w:p>
+    <w:p>
+      <w:r>
+        <w:t>reviewer's opinion, so those were treated as established fact and fixed first.</w:t>
+      </w:r>
+    </w:p>
+    <w:p>
+      <w:r>
+        <w:t>This is the fifth consecutive round in which the highest-value work came from something</w:t>
+      </w:r>
+    </w:p>
+    <w:p>
+      <w:r>
+        <w:t>*other* than reading the code: a real compiler (§3), a real CI runner (§12.4), and now</w:t>
+      </w:r>
+    </w:p>
+    <w:p>
+      <w:r>
+        <w:t>adversarial readers who were told to attack it.</w:t>
+      </w:r>
+    </w:p>
+    <w:p>
+      <w:pPr>
+        <w:pStyle w:val="Heading2"/>
+      </w:pPr>
+      <w:r>
+        <w:t>14.2 The two most serious defects were both silent</w:t>
+      </w:r>
+    </w:p>
+    <w:p>
+      <w:r>
+        <w:t>Neither crashed, neither failed a test, and both had been shipped for three releases.</w:t>
+      </w:r>
+    </w:p>
+    <w:p>
+      <w:pPr>
+        <w:pStyle w:val="ListNumber"/>
+      </w:pPr>
+      <w:r>
+        <w:rPr>
+          <w:b/>
+        </w:rPr>
+        <w:t>A fabricated 30 bpm heart-rate record.</w:t>
+      </w:r>
+      <w:r>
+        <w:t xml:space="preserve"> </w:t>
+      </w:r>
+      <w:r>
+        <w:rPr>
+          <w:rFonts w:ascii="Consolas" w:hAnsi="Consolas"/>
+          <w:color w:val="1F2328"/>
+          <w:sz w:val="18"/>
+        </w:rPr>
+        <w:t>valueStr.toDoubleOrNull() ?: 0.0</w:t>
+      </w:r>
+    </w:p>
+    <w:p>
+      <w:r>
+        <w:t xml:space="preserve">followed by </w:t>
+      </w:r>
+      <w:r>
+        <w:rPr>
+          <w:rFonts w:ascii="Consolas" w:hAnsi="Consolas"/>
+          <w:color w:val="1F2328"/>
+          <w:sz w:val="18"/>
+        </w:rPr>
+        <w:t>coerceIn(30L, 240L)</w:t>
+      </w:r>
+      <w:r>
+        <w:t xml:space="preserve"> meant a </w:t>
+      </w:r>
+      <w:r>
+        <w:rPr>
+          <w:rFonts w:ascii="Consolas" w:hAnsi="Consolas"/>
+          <w:color w:val="1F2328"/>
+          <w:sz w:val="18"/>
+        </w:rPr>
+        <w:t>&lt;Record&gt;</w:t>
+      </w:r>
+      <w:r>
+        <w:t xml:space="preserve"> with a *missing* or</w:t>
+      </w:r>
+    </w:p>
+    <w:p>
+      <w:r>
+        <w:t xml:space="preserve">non-numeric </w:t>
+      </w:r>
+      <w:r>
+        <w:rPr>
+          <w:rFonts w:ascii="Consolas" w:hAnsi="Consolas"/>
+          <w:color w:val="1F2328"/>
+          <w:sz w:val="18"/>
+        </w:rPr>
+        <w:t>value</w:t>
+      </w:r>
+      <w:r>
+        <w:t xml:space="preserve"> attribute was written to Health Connect as a </w:t>
+      </w:r>
+      <w:r>
+        <w:rPr>
+          <w:b/>
+        </w:rPr>
+        <w:t>30 bpm reading</w:t>
+      </w:r>
+      <w:r>
+        <w:t>,</w:t>
+      </w:r>
+    </w:p>
+    <w:p>
+      <w:r>
+        <w:t>and a genuine out-of-range artefact (15 or 290 bpm) was silently rewritten into a</w:t>
+      </w:r>
+    </w:p>
+    <w:p>
+      <w:r>
+        <w:t xml:space="preserve">plausible one. This is the same class of defect as the hardcoded </w:t>
+      </w:r>
+      <w:r>
+        <w:rPr>
+          <w:rFonts w:ascii="Consolas" w:hAnsi="Consolas"/>
+          <w:color w:val="1F2328"/>
+          <w:sz w:val="18"/>
+        </w:rPr>
+        <w:t>spo2 = 98.0</w:t>
+      </w:r>
+      <w:r>
+        <w:t xml:space="preserve"> fixed</w:t>
+      </w:r>
+    </w:p>
+    <w:p>
+      <w:r>
+        <w:t>in v1.0.1 — in a code path that had never been audited. Missing, unparseable and</w:t>
+      </w:r>
+    </w:p>
+    <w:p>
+      <w:r>
+        <w:t xml:space="preserve">out-of-range values are now </w:t>
+      </w:r>
+      <w:r>
+        <w:rPr>
+          <w:b/>
+        </w:rPr>
+        <w:t>skipped</w:t>
+      </w:r>
+      <w:r>
+        <w:t>; the importer no longer substitutes values at</w:t>
+      </w:r>
+    </w:p>
+    <w:p>
+      <w:r>
+        <w:t>all.</w:t>
+      </w:r>
+    </w:p>
+    <w:p>
+      <w:pPr>
+        <w:pStyle w:val="ListNumber"/>
+      </w:pPr>
+      <w:r>
+        <w:rPr>
+          <w:b/>
+        </w:rPr>
+        <w:t>A 2 GB allocation driven by one request header.</w:t>
+      </w:r>
+      <w:r>
+        <w:t xml:space="preserve"> The request body buffer was sized</w:t>
+      </w:r>
+    </w:p>
+    <w:p>
+      <w:r>
+        <w:t xml:space="preserve">from the client-supplied </w:t>
+      </w:r>
+      <w:r>
+        <w:rPr>
+          <w:rFonts w:ascii="Consolas" w:hAnsi="Consolas"/>
+          <w:color w:val="1F2328"/>
+          <w:sz w:val="18"/>
+        </w:rPr>
+        <w:t>Content-Length</w:t>
+      </w:r>
+      <w:r>
+        <w:t xml:space="preserve"> *before any body byte was read*, so</w:t>
+      </w:r>
+    </w:p>
+    <w:p>
+      <w:r>
+        <w:rPr>
+          <w:rFonts w:ascii="Consolas" w:hAnsi="Consolas"/>
+          <w:color w:val="1F2328"/>
+          <w:sz w:val="18"/>
+        </w:rPr>
+        <w:t>Content-Length: 2000000000</w:t>
+      </w:r>
+      <w:r>
+        <w:t xml:space="preserve"> allocated ~4 GB and killed the process — and</w:t>
+      </w:r>
+    </w:p>
+    <w:p>
+      <w:r>
+        <w:rPr>
+          <w:rFonts w:ascii="Consolas" w:hAnsi="Consolas"/>
+          <w:color w:val="1F2328"/>
+          <w:sz w:val="18"/>
+        </w:rPr>
+        <w:t>OutOfMemoryError</w:t>
+      </w:r>
+      <w:r>
+        <w:t xml:space="preserve"> is an </w:t>
+      </w:r>
+      <w:r>
+        <w:rPr>
+          <w:rFonts w:ascii="Consolas" w:hAnsi="Consolas"/>
+          <w:color w:val="1F2328"/>
+          <w:sz w:val="18"/>
+        </w:rPr>
+        <w:t>Error</w:t>
+      </w:r>
+      <w:r>
+        <w:t xml:space="preserve">, so the handler's </w:t>
+      </w:r>
+      <w:r>
+        <w:rPr>
+          <w:rFonts w:ascii="Consolas" w:hAnsi="Consolas"/>
+          <w:color w:val="1F2328"/>
+          <w:sz w:val="18"/>
+        </w:rPr>
+        <w:t>catch (e: Exception)</w:t>
+      </w:r>
+      <w:r>
+        <w:t xml:space="preserve"> never saw</w:t>
+      </w:r>
+    </w:p>
+    <w:p>
+      <w:r>
+        <w:t>it, and the service restarted to be attacked again. Bodies are now capped at 256 KiB</w:t>
+      </w:r>
+    </w:p>
+    <w:p>
+      <w:r>
+        <w:t xml:space="preserve">and refused with </w:t>
+      </w:r>
+      <w:r>
+        <w:rPr>
+          <w:rFonts w:ascii="Consolas" w:hAnsi="Consolas"/>
+          <w:color w:val="1F2328"/>
+          <w:sz w:val="18"/>
+        </w:rPr>
+        <w:t>413</w:t>
+      </w:r>
+      <w:r>
+        <w:t xml:space="preserve"> before allocation; header blocks are bounded and refused</w:t>
+      </w:r>
+    </w:p>
+    <w:p>
+      <w:r>
+        <w:t xml:space="preserve">with </w:t>
+      </w:r>
+      <w:r>
+        <w:rPr>
+          <w:rFonts w:ascii="Consolas" w:hAnsi="Consolas"/>
+          <w:color w:val="1F2328"/>
+          <w:sz w:val="18"/>
+        </w:rPr>
+        <w:t>431</w:t>
+      </w:r>
+      <w:r>
+        <w:t>.</w:t>
+      </w:r>
+    </w:p>
+    <w:p>
+      <w:pPr>
+        <w:pStyle w:val="Heading2"/>
+      </w:pPr>
+      <w:r>
+        <w:t>14.3 Data loss</w:t>
+      </w:r>
+    </w:p>
+    <w:tbl>
+      <w:tblPr>
+        <w:tblStyle w:val="TableGrid"/>
+        <w:tblW w:type="auto" w:w="0"/>
+        <w:tblLook w:firstColumn="1" w:firstRow="1" w:lastColumn="0" w:lastRow="0" w:noHBand="0" w:noVBand="1" w:val="04A0"/>
+      </w:tblPr>
+      <w:tblGrid>
+        <w:gridCol w:w="4320"/>
+        <w:gridCol w:w="4320"/>
+      </w:tblGrid>
+      <w:tr>
+        <w:tc>
+          <w:tcPr>
+            <w:tcW w:type="dxa" w:w="4320"/>
+          </w:tcPr>
+          <w:p>
+            <w:r>
+              <w:rPr>
+                <w:b/>
+                <w:sz w:val="18"/>
+              </w:rPr>
+            </w:r>
+            <w:r>
+              <w:rPr>
+                <w:b/>
+                <w:sz w:val="18"/>
+              </w:rPr>
+              <w:t>Defect</w:t>
+            </w:r>
+          </w:p>
+        </w:tc>
+        <w:tc>
+          <w:tcPr>
+            <w:tcW w:type="dxa" w:w="4320"/>
+          </w:tcPr>
+          <w:p>
+            <w:r>
+              <w:rPr>
+                <w:b/>
+                <w:sz w:val="18"/>
+              </w:rPr>
+            </w:r>
+            <w:r>
+              <w:rPr>
+                <w:b/>
+                <w:sz w:val="18"/>
+              </w:rPr>
+              <w:t>Effect</w:t>
+            </w:r>
+          </w:p>
+        </w:tc>
+      </w:tr>
+      <w:tr>
+        <w:tc>
+          <w:tcPr>
+            <w:tcW w:type="dxa" w:w="4320"/>
+          </w:tcPr>
+          <w:p>
+            <w:r>
+              <w:rPr>
+                <w:sz w:val="18"/>
+              </w:rPr>
+            </w:r>
+            <w:r>
+              <w:rPr>
+                <w:sz w:val="18"/>
+              </w:rPr>
+              <w:t xml:space="preserve">Step deltas shared one hour-stable </w:t>
+            </w:r>
+            <w:r>
+              <w:rPr>
+                <w:rFonts w:ascii="Consolas" w:hAnsi="Consolas"/>
+                <w:color w:val="1F2328"/>
+                <w:sz w:val="18"/>
+              </w:rPr>
+              <w:t>clientRecordId</w:t>
+            </w:r>
+            <w:r>
+              <w:rPr>
+                <w:sz w:val="18"/>
+              </w:rPr>
+              <w:t xml:space="preserve"> with </w:t>
+            </w:r>
+            <w:r>
+              <w:rPr>
+                <w:rFonts w:ascii="Consolas" w:hAnsi="Consolas"/>
+                <w:color w:val="1F2328"/>
+                <w:sz w:val="18"/>
+              </w:rPr>
+              <w:t>clientRecordVersion = 0</w:t>
+            </w:r>
+          </w:p>
+        </w:tc>
+        <w:tc>
+          <w:tcPr>
+            <w:tcW w:type="dxa" w:w="4320"/>
+          </w:tcPr>
+          <w:p>
+            <w:r>
+              <w:rPr>
+                <w:sz w:val="18"/>
+              </w:rPr>
+            </w:r>
+            <w:r>
+              <w:rPr>
+                <w:sz w:val="18"/>
+              </w:rPr>
+              <w:t xml:space="preserve">Health Connect upserts by that id, so </w:t>
+            </w:r>
+            <w:r>
+              <w:rPr>
+                <w:b/>
+                <w:sz w:val="18"/>
+              </w:rPr>
+              <w:t>every delta in an hour overwrote the previous one</w:t>
+            </w:r>
+            <w:r>
+              <w:rPr>
+                <w:sz w:val="18"/>
+              </w:rPr>
+              <w:t xml:space="preserve"> — an hour could never accumulate its steps</w:t>
+            </w:r>
+          </w:p>
+        </w:tc>
+      </w:tr>
+      <w:tr>
+        <w:tc>
+          <w:tcPr>
+            <w:tcW w:type="dxa" w:w="4320"/>
+          </w:tcPr>
+          <w:p>
+            <w:r>
+              <w:rPr>
+                <w:sz w:val="18"/>
+              </w:rPr>
+            </w:r>
+            <w:r>
+              <w:rPr>
+                <w:sz w:val="18"/>
+              </w:rPr>
+              <w:t>The watch sent a *per-workout* step count to a phone that treats steps as a monotonic daily counter</w:t>
+            </w:r>
+          </w:p>
+        </w:tc>
+        <w:tc>
+          <w:tcPr>
+            <w:tcW w:type="dxa" w:w="4320"/>
+          </w:tcPr>
+          <w:p>
+            <w:r>
+              <w:rPr>
+                <w:sz w:val="18"/>
+              </w:rPr>
+            </w:r>
+            <w:r>
+              <w:rPr>
+                <w:sz w:val="18"/>
+              </w:rPr>
+              <w:t>Every step after a workout restart was discarded until the new session passed the old total</w:t>
+            </w:r>
+          </w:p>
+        </w:tc>
+      </w:tr>
+      <w:tr>
+        <w:tc>
+          <w:tcPr>
+            <w:tcW w:type="dxa" w:w="4320"/>
+          </w:tcPr>
+          <w:p>
+            <w:r>
+              <w:rPr>
+                <w:sz w:val="18"/>
+              </w:rPr>
+            </w:r>
+            <w:r>
+              <w:rPr>
+                <w:sz w:val="18"/>
+              </w:rPr>
+              <w:t xml:space="preserve">The in-memory step baseline was only re-established in </w:t>
+            </w:r>
+            <w:r>
+              <w:rPr>
+                <w:rFonts w:ascii="Consolas" w:hAnsi="Consolas"/>
+                <w:color w:val="1F2328"/>
+                <w:sz w:val="18"/>
+              </w:rPr>
+              <w:t>onCreate</w:t>
+            </w:r>
+          </w:p>
+        </w:tc>
+        <w:tc>
+          <w:tcPr>
+            <w:tcW w:type="dxa" w:w="4320"/>
+          </w:tcPr>
+          <w:p>
+            <w:r>
+              <w:rPr>
+                <w:sz w:val="18"/>
+              </w:rPr>
+            </w:r>
+            <w:r>
+              <w:rPr>
+                <w:sz w:val="18"/>
+              </w:rPr>
+              <w:t xml:space="preserve">A service running overnight kept yesterday's baseline and </w:t>
+            </w:r>
+            <w:r>
+              <w:rPr>
+                <w:b/>
+                <w:sz w:val="18"/>
+              </w:rPr>
+              <w:t>swallowed the new day's steps</w:t>
+            </w:r>
+            <w:r>
+              <w:rPr>
+                <w:sz w:val="18"/>
+              </w:rPr>
+              <w:t>, often until the afternoon</w:t>
+            </w:r>
+          </w:p>
+        </w:tc>
+      </w:tr>
+      <w:tr>
+        <w:tc>
+          <w:tcPr>
+            <w:tcW w:type="dxa" w:w="4320"/>
+          </w:tcPr>
+          <w:p>
+            <w:r>
+              <w:rPr>
+                <w:sz w:val="18"/>
+              </w:rPr>
+            </w:r>
+            <w:r>
+              <w:rPr>
+                <w:rFonts w:ascii="Consolas" w:hAnsi="Consolas"/>
+                <w:color w:val="1F2328"/>
+                <w:sz w:val="18"/>
+              </w:rPr>
+              <w:t>Health Auto Export</w:t>
+            </w:r>
+            <w:r>
+              <w:rPr>
+                <w:sz w:val="18"/>
+              </w:rPr>
+              <w:t xml:space="preserve"> </w:t>
+            </w:r>
+            <w:r>
+              <w:rPr>
+                <w:rFonts w:ascii="Consolas" w:hAnsi="Consolas"/>
+                <w:color w:val="1F2328"/>
+                <w:sz w:val="18"/>
+              </w:rPr>
+              <w:t>sleep_analysis</w:t>
+            </w:r>
+            <w:r>
+              <w:rPr>
+                <w:sz w:val="18"/>
+              </w:rPr>
+              <w:t xml:space="preserve"> durations are </w:t>
+            </w:r>
+            <w:r>
+              <w:rPr>
+                <w:b/>
+                <w:sz w:val="18"/>
+              </w:rPr>
+              <w:t>hours</w:t>
+            </w:r>
+            <w:r>
+              <w:rPr>
+                <w:sz w:val="18"/>
+              </w:rPr>
+              <w:t>; they were read as minutes</w:t>
+            </w:r>
+          </w:p>
+        </w:tc>
+        <w:tc>
+          <w:tcPr>
+            <w:tcW w:type="dxa" w:w="4320"/>
+          </w:tcPr>
+          <w:p>
+            <w:r>
+              <w:rPr>
+                <w:sz w:val="18"/>
+              </w:rPr>
+            </w:r>
+            <w:r>
+              <w:rPr>
+                <w:sz w:val="18"/>
+              </w:rPr>
+              <w:t xml:space="preserve">A 7.5-hour night was written as a </w:t>
+            </w:r>
+            <w:r>
+              <w:rPr>
+                <w:b/>
+                <w:sz w:val="18"/>
+              </w:rPr>
+              <w:t>7-minute</w:t>
+            </w:r>
+            <w:r>
+              <w:rPr>
+                <w:sz w:val="18"/>
+              </w:rPr>
+              <w:t xml:space="preserve"> sleep session</w:t>
+            </w:r>
+          </w:p>
+        </w:tc>
+      </w:tr>
+      <w:tr>
+        <w:tc>
+          <w:tcPr>
+            <w:tcW w:type="dxa" w:w="4320"/>
+          </w:tcPr>
+          <w:p>
+            <w:r>
+              <w:rPr>
+                <w:sz w:val="18"/>
+              </w:rPr>
+            </w:r>
+            <w:r>
+              <w:rPr>
+                <w:sz w:val="18"/>
+              </w:rPr>
+              <w:t>The HR sample buffer was drained *before* the flush</w:t>
+            </w:r>
+          </w:p>
+        </w:tc>
+        <w:tc>
+          <w:tcPr>
+            <w:tcW w:type="dxa" w:w="4320"/>
+          </w:tcPr>
+          <w:p>
+            <w:r>
+              <w:rPr>
+                <w:sz w:val="18"/>
+              </w:rPr>
+            </w:r>
+            <w:r>
+              <w:rPr>
+                <w:sz w:val="18"/>
+              </w:rPr>
+              <w:t>When Health Connect was unavailable (</w:t>
+            </w:r>
+            <w:r>
+              <w:rPr>
+                <w:rFonts w:ascii="Consolas" w:hAnsi="Consolas"/>
+                <w:color w:val="1F2328"/>
+                <w:sz w:val="18"/>
+              </w:rPr>
+              <w:t>client == null</w:t>
+            </w:r>
+            <w:r>
+              <w:rPr>
+                <w:sz w:val="18"/>
+              </w:rPr>
+              <w:t xml:space="preserve"> returns 0 without throwing) every 15 s of samples was discarded, forever, with no log line</w:t>
+            </w:r>
+          </w:p>
+        </w:tc>
+      </w:tr>
+      <w:tr>
+        <w:tc>
+          <w:tcPr>
+            <w:tcW w:type="dxa" w:w="4320"/>
+          </w:tcPr>
+          <w:p>
+            <w:r>
+              <w:rPr>
+                <w:sz w:val="18"/>
+              </w:rPr>
+            </w:r>
+            <w:r>
+              <w:rPr>
+                <w:sz w:val="18"/>
+              </w:rPr>
+              <w:t xml:space="preserve">A truncated </w:t>
+            </w:r>
+            <w:r>
+              <w:rPr>
+                <w:rFonts w:ascii="Consolas" w:hAnsi="Consolas"/>
+                <w:color w:val="1F2328"/>
+                <w:sz w:val="18"/>
+              </w:rPr>
+              <w:t>export.xml</w:t>
+            </w:r>
+            <w:r>
+              <w:rPr>
+                <w:sz w:val="18"/>
+              </w:rPr>
+              <w:t xml:space="preserve"> threw out of the whole scan</w:t>
+            </w:r>
+          </w:p>
+        </w:tc>
+        <w:tc>
+          <w:tcPr>
+            <w:tcW w:type="dxa" w:w="4320"/>
+          </w:tcPr>
+          <w:p>
+            <w:r>
+              <w:rPr>
+                <w:sz w:val="18"/>
+              </w:rPr>
+            </w:r>
+            <w:r>
+              <w:rPr>
+                <w:sz w:val="18"/>
+              </w:rPr>
+              <w:t xml:space="preserve">One bad byte in a multi-hundred-megabyte export lost </w:t>
+            </w:r>
+            <w:r>
+              <w:rPr>
+                <w:b/>
+                <w:sz w:val="18"/>
+              </w:rPr>
+              <w:t>every</w:t>
+            </w:r>
+            <w:r>
+              <w:rPr>
+                <w:sz w:val="18"/>
+              </w:rPr>
+              <w:t xml:space="preserve"> record, including those already parsed</w:t>
+            </w:r>
+          </w:p>
+        </w:tc>
+      </w:tr>
+      <w:tr>
+        <w:tc>
+          <w:tcPr>
+            <w:tcW w:type="dxa" w:w="4320"/>
+          </w:tcPr>
+          <w:p>
+            <w:r>
+              <w:rPr>
+                <w:sz w:val="18"/>
+              </w:rPr>
+            </w:r>
+            <w:r>
+              <w:rPr>
+                <w:sz w:val="18"/>
+              </w:rPr>
+              <w:t>Record ids ignored the source</w:t>
+            </w:r>
+          </w:p>
+        </w:tc>
+        <w:tc>
+          <w:tcPr>
+            <w:tcW w:type="dxa" w:w="4320"/>
+          </w:tcPr>
+          <w:p>
+            <w:r>
+              <w:rPr>
+                <w:sz w:val="18"/>
+              </w:rPr>
+            </w:r>
+            <w:r>
+              <w:rPr>
+                <w:sz w:val="18"/>
+              </w:rPr>
+              <w:t>Apple's export contains overlapping iPhone and Watch records at second granularity, so they either collapsed into one or were double-counted</w:t>
+            </w:r>
+          </w:p>
+        </w:tc>
+      </w:tr>
+    </w:tbl>
+    <w:p/>
+    <w:p>
+      <w:pPr>
+        <w:pStyle w:val="Heading2"/>
+      </w:pPr>
+      <w:r>
+        <w:t>14.4 Mislabelled clinical data</w:t>
+      </w:r>
+    </w:p>
+    <w:p>
+      <w:pPr>
+        <w:pStyle w:val="ListBullet"/>
+      </w:pPr>
+      <w:r>
+        <w:rPr>
+          <w:b/>
+        </w:rPr>
+        <w:t>SDNN written as RMSSD.</w:t>
+      </w:r>
+      <w:r>
+        <w:t xml:space="preserve"> </w:t>
+      </w:r>
+      <w:r>
+        <w:rPr>
+          <w:rFonts w:ascii="Consolas" w:hAnsi="Consolas"/>
+          <w:color w:val="1F2328"/>
+          <w:sz w:val="18"/>
+        </w:rPr>
+        <w:t>D-05</w:t>
+      </w:r>
+      <w:r>
+        <w:t xml:space="preserve"> had gated SDNN in the XML importer only; the two JSON</w:t>
+      </w:r>
+    </w:p>
+    <w:p>
+      <w:r>
+        <w:t xml:space="preserve">paths and the watch </w:t>
+      </w:r>
+      <w:r>
+        <w:rPr>
+          <w:b/>
+        </w:rPr>
+        <w:t>all</w:t>
+      </w:r>
+      <w:r>
+        <w:t xml:space="preserve"> wrote Apple's SDNN numbers into</w:t>
+      </w:r>
+    </w:p>
+    <w:p>
+      <w:r>
+        <w:rPr>
+          <w:rFonts w:ascii="Consolas" w:hAnsi="Consolas"/>
+          <w:color w:val="1F2328"/>
+          <w:sz w:val="18"/>
+        </w:rPr>
+        <w:t>HeartRateVariabilityRmssdRecord</w:t>
+      </w:r>
+      <w:r>
+        <w:t>, which stores RMSSD. Three auditors found this</w:t>
+      </w:r>
+    </w:p>
+    <w:p>
+      <w:r>
+        <w:t>independently. SDNN-named keys are now rejected everywhere and the watch no longer</w:t>
+      </w:r>
+    </w:p>
+    <w:p>
+      <w:r>
+        <w:t xml:space="preserve">sends </w:t>
+      </w:r>
+      <w:r>
+        <w:rPr>
+          <w:rFonts w:ascii="Consolas" w:hAnsi="Consolas"/>
+          <w:color w:val="1F2328"/>
+          <w:sz w:val="18"/>
+        </w:rPr>
+        <w:t>hrvMs</w:t>
+      </w:r>
+      <w:r>
+        <w:t>.</w:t>
+      </w:r>
+    </w:p>
+    <w:p>
+      <w:pPr>
+        <w:pStyle w:val="ListBullet"/>
+      </w:pPr>
+      <w:r>
+        <w:rPr>
+          <w:b/>
+        </w:rPr>
+        <w:t>Producer units ignored.</w:t>
+      </w:r>
+      <w:r>
+        <w:t xml:space="preserve"> </w:t>
+      </w:r>
+      <w:r>
+        <w:rPr>
+          <w:rFonts w:ascii="Consolas" w:hAnsi="Consolas"/>
+          <w:color w:val="1F2328"/>
+          <w:sz w:val="18"/>
+        </w:rPr>
+        <w:t>walking_running_distance</w:t>
+      </w:r>
+      <w:r>
+        <w:t xml:space="preserve"> was assumed to be kilometres and</w:t>
+      </w:r>
+    </w:p>
+    <w:p>
+      <w:r>
+        <w:t xml:space="preserve">everything else metres or kilocalories, so a </w:t>
+      </w:r>
+      <w:r>
+        <w:rPr>
+          <w:rFonts w:ascii="Consolas" w:hAnsi="Consolas"/>
+          <w:color w:val="1F2328"/>
+          <w:sz w:val="18"/>
+        </w:rPr>
+        <w:t>mi</w:t>
+      </w:r>
+      <w:r>
+        <w:t>/</w:t>
+      </w:r>
+      <w:r>
+        <w:rPr>
+          <w:rFonts w:ascii="Consolas" w:hAnsi="Consolas"/>
+          <w:color w:val="1F2328"/>
+          <w:sz w:val="18"/>
+        </w:rPr>
+        <w:t>kJ</w:t>
+      </w:r>
+      <w:r>
+        <w:t xml:space="preserve"> payload (Health Auto Export's</w:t>
+      </w:r>
+    </w:p>
+    <w:p>
+      <w:r>
+        <w:t>units are per-metric user preferences) was written with wrong magnitudes. Every string</w:t>
+      </w:r>
+    </w:p>
+    <w:p>
+      <w:r>
+        <w:t xml:space="preserve">path and the XML importer now convert from the stated unit and </w:t>
+      </w:r>
+      <w:r>
+        <w:rPr>
+          <w:b/>
+        </w:rPr>
+        <w:t>skip</w:t>
+      </w:r>
+      <w:r>
+        <w:t xml:space="preserve"> unknown ones.</w:t>
+      </w:r>
+    </w:p>
+    <w:p>
+      <w:pPr>
+        <w:pStyle w:val="ListBullet"/>
+      </w:pPr>
+      <w:r>
+        <w:rPr>
+          <w:b/>
+        </w:rPr>
+        <w:t>Apple's UTC offset was discarded</w:t>
+      </w:r>
+      <w:r>
+        <w:t xml:space="preserve"> and re-derived from the phone's zone, mislabelling</w:t>
+      </w:r>
+    </w:p>
+    <w:p>
+      <w:r>
+        <w:t>the local time of every record from an export recorded elsewhere.</w:t>
+      </w:r>
+    </w:p>
+    <w:p>
+      <w:pPr>
+        <w:pStyle w:val="Heading2"/>
+      </w:pPr>
+      <w:r>
+        <w:t>14.5 A defect the earlier audits did not reach: platform ceilings</w:t>
+      </w:r>
+    </w:p>
+    <w:p>
+      <w:r>
+        <w:t xml:space="preserve">Probing the resolved </w:t>
+      </w:r>
+      <w:r>
+        <w:rPr>
+          <w:rFonts w:ascii="Consolas" w:hAnsi="Consolas"/>
+          <w:color w:val="1F2328"/>
+          <w:sz w:val="18"/>
+        </w:rPr>
+        <w:t>connect-client:1.1.0</w:t>
+      </w:r>
+      <w:r>
+        <w:t xml:space="preserve"> artifact showed that Health Connect's own</w:t>
+      </w:r>
+    </w:p>
+    <w:p>
+      <w:r>
+        <w:t xml:space="preserve">record constructors </w:t>
+      </w:r>
+      <w:r>
+        <w:rPr>
+          <w:b/>
+        </w:rPr>
+        <w:t>throw</w:t>
+      </w:r>
+      <w:r>
+        <w:t xml:space="preserve"> above certain limits:</w:t>
+      </w:r>
+    </w:p>
+    <w:p>
+      <w:pPr>
+        <w:spacing w:after="200"/>
+        <w:ind w:left="280"/>
+      </w:pPr>
+      <w:r>
+        <w:rPr>
+          <w:rFonts w:ascii="Consolas" w:hAnsi="Consolas"/>
+          <w:color w:val="1F2328"/>
+          <w:sz w:val="17"/>
+        </w:rPr>
+        <w:t>HeartRateVariabilityRmssdRecord  &gt; 200.0 ms          -&gt; IllegalArgumentException</w:t>
+        <w:br/>
+        <w:t>StepsRecord                      &gt; 1000000           -&gt; IllegalArgumentException</w:t>
+        <w:br/>
+        <w:t>DistanceRecord                   &gt; 1000000.0 meters  -&gt; IllegalArgumentException</w:t>
+        <w:br/>
+        <w:t>ActiveCaloriesBurnedRecord       &gt; 1000000.0 kcal    -&gt; IllegalArgumentException</w:t>
+        <w:br/>
+        <w:t>FloorsClimbedRecord              &gt; 1000000.0         -&gt; IllegalArgumentException</w:t>
+      </w:r>
+    </w:p>
+    <w:p>
+      <w:r>
+        <w:t xml:space="preserve">The app's gates allowed </w:t>
+      </w:r>
+      <w:r>
+        <w:rPr>
+          <w:rFonts w:ascii="Consolas" w:hAnsi="Consolas"/>
+          <w:color w:val="1F2328"/>
+          <w:sz w:val="18"/>
+        </w:rPr>
+        <w:t>hrvMs</w:t>
+      </w:r>
+      <w:r>
+        <w:t xml:space="preserve"> up to 250 and had </w:t>
+      </w:r>
+      <w:r>
+        <w:rPr>
+          <w:b/>
+        </w:rPr>
+        <w:t>no</w:t>
+      </w:r>
+      <w:r>
+        <w:t xml:space="preserve"> upper bound on steps, distance,</w:t>
+      </w:r>
+    </w:p>
+    <w:p>
+      <w:r>
+        <w:t>energy or floors. Because the throw happens while *building* the batch, a single</w:t>
+      </w:r>
+    </w:p>
+    <w:p>
+      <w:r>
+        <w:t xml:space="preserve">over-limit value rejected the entire </w:t>
+      </w:r>
+      <w:r>
+        <w:rPr>
+          <w:rFonts w:ascii="Consolas" w:hAnsi="Consolas"/>
+          <w:color w:val="1F2328"/>
+          <w:sz w:val="18"/>
+        </w:rPr>
+        <w:t>insertRecords</w:t>
+      </w:r>
+      <w:r>
+        <w:t xml:space="preserve"> call and **lost every valid record</w:t>
+      </w:r>
+    </w:p>
+    <w:p>
+      <w:r>
+        <w:t>alongside it**. All gates now match the platform, and a test proves that one bad metric</w:t>
+      </w:r>
+    </w:p>
+    <w:p>
+      <w:r>
+        <w:t>no longer takes its neighbours with it.</w:t>
+      </w:r>
+    </w:p>
+    <w:p>
+      <w:pPr>
+        <w:pStyle w:val="Heading2"/>
+      </w:pPr>
+      <w:r>
+        <w:t>14.6 Everything else closed</w:t>
+      </w:r>
+    </w:p>
+    <w:p>
+      <w:r>
+        <w:t>Non-finite values (</w:t>
+      </w:r>
+      <w:r>
+        <w:rPr>
+          <w:rFonts w:ascii="Consolas" w:hAnsi="Consolas"/>
+          <w:color w:val="1F2328"/>
+          <w:sz w:val="18"/>
+        </w:rPr>
+        <w:t>"1e999"</w:t>
+      </w:r>
+      <w:r>
+        <w:t xml:space="preserve"> → </w:t>
+      </w:r>
+      <w:r>
+        <w:rPr>
+          <w:rFonts w:ascii="Consolas" w:hAnsi="Consolas"/>
+          <w:color w:val="1F2328"/>
+          <w:sz w:val="18"/>
+        </w:rPr>
+        <w:t>Infinity</w:t>
+      </w:r>
+      <w:r>
+        <w:t xml:space="preserve">) passing every </w:t>
+      </w:r>
+      <w:r>
+        <w:rPr>
+          <w:rFonts w:ascii="Consolas" w:hAnsi="Consolas"/>
+          <w:color w:val="1F2328"/>
+          <w:sz w:val="18"/>
+        </w:rPr>
+        <w:t>&gt; 0.0</w:t>
+      </w:r>
+      <w:r>
+        <w:t xml:space="preserve"> gate, and </w:t>
+      </w:r>
+      <w:r>
+        <w:rPr>
+          <w:rFonts w:ascii="Consolas" w:hAnsi="Consolas"/>
+          <w:color w:val="1F2328"/>
+          <w:sz w:val="18"/>
+        </w:rPr>
+        <w:t>Infinity</w:t>
+      </w:r>
+    </w:p>
+    <w:p>
+      <w:r>
+        <w:t xml:space="preserve">saturating to </w:t>
+      </w:r>
+      <w:r>
+        <w:rPr>
+          <w:rFonts w:ascii="Consolas" w:hAnsi="Consolas"/>
+          <w:color w:val="1F2328"/>
+          <w:sz w:val="18"/>
+        </w:rPr>
+        <w:t>Long.MAX_VALUE</w:t>
+      </w:r>
+      <w:r>
+        <w:t xml:space="preserve"> to poison the persisted step baseline · </w:t>
+      </w:r>
+      <w:r>
+        <w:rPr>
+          <w:rFonts w:ascii="Consolas" w:hAnsi="Consolas"/>
+          <w:color w:val="1F2328"/>
+          <w:sz w:val="18"/>
+        </w:rPr>
+        <w:t>sleepMinutes</w:t>
+      </w:r>
+    </w:p>
+    <w:p>
+      <w:r>
+        <w:t xml:space="preserve">overflow making a session end before it started · a leaked </w:t>
+      </w:r>
+      <w:r>
+        <w:rPr>
+          <w:rFonts w:ascii="Consolas" w:hAnsi="Consolas"/>
+          <w:color w:val="1F2328"/>
+          <w:sz w:val="18"/>
+        </w:rPr>
+        <w:t>BluetoothGatt</w:t>
+      </w:r>
+      <w:r>
+        <w:t xml:space="preserve"> client per</w:t>
+      </w:r>
+    </w:p>
+    <w:p>
+      <w:r>
+        <w:t>disconnect · the GATT operation queue advanced from three unsynchronised contexts ·</w:t>
+      </w:r>
+    </w:p>
+    <w:p>
+      <w:r>
+        <w:t>telemetry state mutated with non-atomic read-modify-write from five contexts ·</w:t>
+      </w:r>
+    </w:p>
+    <w:p>
+      <w:r>
+        <w:t>the "bounded retry" bypassed by the low-latency scan · a second-granular HRV record id</w:t>
+      </w:r>
+    </w:p>
+    <w:p>
+      <w:r>
+        <w:t>(</w:t>
+      </w:r>
+      <w:r>
+        <w:rPr>
+          <w:rFonts w:ascii="Consolas" w:hAnsi="Consolas"/>
+          <w:color w:val="1F2328"/>
+          <w:sz w:val="18"/>
+        </w:rPr>
+        <w:t>D-07</w:t>
+      </w:r>
+      <w:r>
+        <w:t xml:space="preserve"> applied elsewhere) · camera-shutter reporting success whenever </w:t>
+      </w:r>
+      <w:r>
+        <w:rPr>
+          <w:rFonts w:ascii="Consolas" w:hAnsi="Consolas"/>
+          <w:color w:val="1F2328"/>
+          <w:sz w:val="18"/>
+        </w:rPr>
+        <w:t>sendBroadcast</w:t>
+      </w:r>
+    </w:p>
+    <w:p>
+      <w:r>
+        <w:t>did not throw (it never throws with no receiver) · the auth badge reading the service's</w:t>
+      </w:r>
+    </w:p>
+    <w:p>
+      <w:r>
+        <w:t>static token, so it claimed "No Token Set" for a persisted token · the bridge token</w:t>
+      </w:r>
+    </w:p>
+    <w:p>
+      <w:r>
+        <w:t>included in Android Auto Backup · alarms stacking without bound · a second</w:t>
+      </w:r>
+    </w:p>
+    <w:p>
+      <w:r>
+        <w:rPr>
+          <w:rFonts w:ascii="Consolas" w:hAnsi="Consolas"/>
+          <w:color w:val="1F2328"/>
+          <w:sz w:val="18"/>
+        </w:rPr>
+        <w:t>HKWorkoutSession</w:t>
+      </w:r>
+      <w:r>
+        <w:t xml:space="preserve"> that could be started and never stopped · control buttons POSTing to</w:t>
+      </w:r>
+    </w:p>
+    <w:p>
+      <w:r>
+        <w:rPr>
+          <w:rFonts w:ascii="Consolas" w:hAnsi="Consolas"/>
+          <w:color w:val="1F2328"/>
+          <w:sz w:val="18"/>
+        </w:rPr>
+        <w:t>/telemetry</w:t>
+      </w:r>
+      <w:r>
+        <w:t xml:space="preserve">, which </w:t>
+      </w:r>
+      <w:r>
+        <w:rPr>
+          <w:b/>
+        </w:rPr>
+        <w:t>re-committed stale telemetry as fresh records</w:t>
+      </w:r>
+      <w:r>
+        <w:t xml:space="preserve"> on every press ·</w:t>
+      </w:r>
+    </w:p>
+    <w:p>
+      <w:r>
+        <w:t xml:space="preserve">and the missing HealthKit </w:t>
+      </w:r>
+      <w:r>
+        <w:rPr>
+          <w:b/>
+        </w:rPr>
+        <w:t>entitlement</w:t>
+      </w:r>
+      <w:r>
+        <w:t xml:space="preserve"> (only the usage strings were present).</w:t>
+      </w:r>
+    </w:p>
+    <w:p>
+      <w:pPr>
+        <w:pStyle w:val="Heading2"/>
+      </w:pPr>
+      <w:r>
+        <w:t>14.7 Test honesty</w:t>
+      </w:r>
+    </w:p>
+    <w:p>
+      <w:r>
+        <w:t>The auditors' sharpest finding was about my own tests: **the manager's ten sentinel</w:t>
+      </w:r>
+    </w:p>
+    <w:p>
+      <w:r>
+        <w:t>gates had zero coverage.** They were reachable only through a live Health Connect client,</w:t>
+      </w:r>
+    </w:p>
+    <w:p>
+      <w:r>
+        <w:t>which a JVM test cannot construct — so *deleting all ten guards kept the suite green*.</w:t>
+      </w:r>
+    </w:p>
+    <w:p>
+      <w:r>
+        <w:t>The contract the parser tests claimed was enforced "downstream" was enforced nowhere.</w:t>
+      </w:r>
+    </w:p>
+    <w:p>
+      <w:r>
+        <w:rPr>
+          <w:rFonts w:ascii="Consolas" w:hAnsi="Consolas"/>
+          <w:color w:val="1F2328"/>
+          <w:sz w:val="18"/>
+        </w:rPr>
+        <w:t>buildTelemetryRecords()</w:t>
+      </w:r>
+      <w:r>
+        <w:t xml:space="preserve"> is now a pure, internal function and every boundary is pinned</w:t>
+      </w:r>
+    </w:p>
+    <w:p>
+      <w:r>
+        <w:t>(30/240 bpm, 70/100 SpO₂, 1/200 ms HRV, 30/150 resting HR, 4/60 respiration, sleep and</w:t>
+      </w:r>
+    </w:p>
+    <w:p>
+      <w:r>
+        <w:t>step bounds, platform ceilings). Two further test defects were fixed: the XML importer</w:t>
+      </w:r>
+    </w:p>
+    <w:p>
+      <w:r>
+        <w:t xml:space="preserve">tests had been exercising </w:t>
+      </w:r>
+      <w:r>
+        <w:rPr>
+          <w:b/>
+        </w:rPr>
+        <w:t>stubbed</w:t>
+      </w:r>
+      <w:r>
+        <w:t xml:space="preserve"> Android XML — </w:t>
+      </w:r>
+      <w:r>
+        <w:rPr>
+          <w:rFonts w:ascii="Consolas" w:hAnsi="Consolas"/>
+          <w:color w:val="1F2328"/>
+          <w:sz w:val="18"/>
+        </w:rPr>
+        <w:t>Xml.newPullParser()</w:t>
+      </w:r>
+      <w:r>
+        <w:t xml:space="preserve"> and</w:t>
+      </w:r>
+    </w:p>
+    <w:p>
+      <w:r>
+        <w:rPr>
+          <w:rFonts w:ascii="Consolas" w:hAnsi="Consolas"/>
+          <w:color w:val="1F2328"/>
+          <w:sz w:val="18"/>
+        </w:rPr>
+        <w:t>XmlPullParserFactory.newInstance()</w:t>
+      </w:r>
+      <w:r>
+        <w:t xml:space="preserve"> both return defaults in the JVM runtime, so those</w:t>
+      </w:r>
+    </w:p>
+    <w:p>
+      <w:r>
+        <w:t>tests observed zero records and passed for the wrong reason — and the record-id test was</w:t>
+      </w:r>
+    </w:p>
+    <w:p>
+      <w:r>
+        <w:t>a tautology that asserted two literals the test itself had written differ.</w:t>
+      </w:r>
+    </w:p>
+    <w:p>
+      <w:r>
+        <w:t xml:space="preserve">Test count </w:t>
+      </w:r>
+      <w:r>
+        <w:rPr>
+          <w:b/>
+        </w:rPr>
+        <w:t>84 → 113</w:t>
+      </w:r>
+      <w:r>
+        <w:t>. Lint 0 errors. Both CI jobs green, including XcodeGen</w:t>
+      </w:r>
+    </w:p>
+    <w:p>
+      <w:r>
+        <w:t xml:space="preserve">generation, the Swift type-check and </w:t>
+      </w:r>
+      <w:r>
+        <w:rPr>
+          <w:rFonts w:ascii="Consolas" w:hAnsi="Consolas"/>
+          <w:color w:val="1F2328"/>
+          <w:sz w:val="18"/>
+        </w:rPr>
+        <w:t>xcodebuild</w:t>
+      </w:r>
+      <w:r>
+        <w:t xml:space="preserve"> — now on </w:t>
+      </w:r>
+      <w:r>
+        <w:rPr>
+          <w:rFonts w:ascii="Consolas" w:hAnsi="Consolas"/>
+          <w:color w:val="1F2328"/>
+          <w:sz w:val="18"/>
+        </w:rPr>
+        <w:t>macos-15</w:t>
+      </w:r>
+      <w:r>
+        <w:t>, because</w:t>
+      </w:r>
+    </w:p>
+    <w:p>
+      <w:r>
+        <w:rPr>
+          <w:rFonts w:ascii="Consolas" w:hAnsi="Consolas"/>
+          <w:color w:val="1F2328"/>
+          <w:sz w:val="18"/>
+        </w:rPr>
+        <w:t>macos-14</w:t>
+      </w:r>
+      <w:r>
+        <w:t xml:space="preserve"> was retired on 2026-11-02 and every job pinned to it would have failed at</w:t>
+      </w:r>
+    </w:p>
+    <w:p>
+      <w:r>
+        <w:t>scheduling, silently removing the entire watchOS gate.</w:t>
+      </w:r>
+    </w:p>
+    <w:p>
+      <w:pPr>
+        <w:pStyle w:val="Heading2"/>
+      </w:pPr>
+      <w:r>
+        <w:t>14.8 Two deliberate, documented non-fixes</w:t>
+      </w:r>
+    </w:p>
+    <w:p>
+      <w:pPr>
+        <w:pStyle w:val="ListBullet"/>
+      </w:pPr>
+      <w:r>
+        <w:rPr>
+          <w:b/>
+        </w:rPr>
+        <w:t>Releases remain signed with the Android debug key.</w:t>
+      </w:r>
+      <w:r>
+        <w:t xml:space="preserve"> This is the project's</w:t>
+      </w:r>
+    </w:p>
+    <w:p>
+      <w:r>
+        <w:t>documented choice so CI artifacts are immediately sideloadable. It is a real tradeoff</w:t>
+      </w:r>
+    </w:p>
+    <w:p>
+      <w:r>
+        <w:t>— anyone can re-sign them, and they cannot upgrade a properly-signed install — but it</w:t>
+      </w:r>
+    </w:p>
+    <w:p>
+      <w:r>
+        <w:t>is a product decision, not an oversight, and the owner chose to keep it.</w:t>
+      </w:r>
+    </w:p>
+    <w:p>
+      <w:pPr>
+        <w:pStyle w:val="ListBullet"/>
+      </w:pPr>
+      <w:r>
+        <w:rPr>
+          <w:b/>
+        </w:rPr>
+        <w:t>`docs/GEMINI_REVIEW_PACKET_Give.md` was never committed.</w:t>
+      </w:r>
+      <w:r>
+        <w:t xml:space="preserve"> It is byte-identical</w:t>
+      </w:r>
+    </w:p>
+    <w:p>
+      <w:r>
+        <w:t xml:space="preserve">(SHA-256 </w:t>
+      </w:r>
+      <w:r>
+        <w:rPr>
+          <w:rFonts w:ascii="Consolas" w:hAnsi="Consolas"/>
+          <w:color w:val="1F2328"/>
+          <w:sz w:val="18"/>
+        </w:rPr>
+        <w:t>38C82206…</w:t>
+      </w:r>
+      <w:r>
+        <w:t xml:space="preserve">) to the tracked </w:t>
+      </w:r>
+      <w:r>
+        <w:rPr>
+          <w:rFonts w:ascii="Consolas" w:hAnsi="Consolas"/>
+          <w:color w:val="1F2328"/>
+          <w:sz w:val="18"/>
+        </w:rPr>
+        <w:t>docs/GEMINI_REVIEW_PACKET.md</w:t>
+      </w:r>
+      <w:r>
+        <w:t>; committing it</w:t>
+      </w:r>
+    </w:p>
+    <w:p>
+      <w:r>
+        <w:t>would add a duplicate 159 KB document. It has now been deleted from the working tree.</w:t>
+      </w:r>
+    </w:p>
+    <w:p>
+      <w:pPr>
+        <w:pStyle w:val="Heading2"/>
+      </w:pPr>
+      <w:r>
+        <w:t>14.9 Limits, unchanged</w:t>
+      </w:r>
+    </w:p>
+    <w:p>
+      <w:r>
+        <w:t xml:space="preserve">The APK has </w:t>
+      </w:r>
+      <w:r>
+        <w:rPr>
+          <w:b/>
+        </w:rPr>
+        <w:t>still never run on a physical device</w:t>
+      </w:r>
+      <w:r>
+        <w:t>. Nothing here was validated against</w:t>
+      </w:r>
+    </w:p>
+    <w:p>
+      <w:r>
+        <w:t>a real radio, a real Health Connect provider, or a real Apple Watch. 113 tests prove the</w:t>
+      </w:r>
+    </w:p>
+    <w:p>
+      <w:r>
+        <w:t>code compiles, lints, and behaves under test — not that it works on hardware.</w:t>
       </w:r>
     </w:p>
     <w:sectPr>

</xml_diff>